<commit_message>
menu: tick settings menu: show mac address
</commit_message>
<xml_diff>
--- a/Instructions.docx
+++ b/Instructions.docx
@@ -22,12 +22,8 @@
     </w:p>
     <w:p>
       <w:pPr>
+        <w:pStyle w:val="Title"/>
         <w:jc w:val="center"/>
-        <w:rPr>
-          <w:rFonts w:asciiTheme="majorHAnsi" w:hAnsiTheme="majorHAnsi"/>
-          <w:sz w:val="56"/>
-          <w:szCs w:val="56"/>
-        </w:rPr>
       </w:pPr>
       <w:r>
         <w:rPr>
@@ -60,10 +56,10 @@
                     <pic:cNvPicPr/>
                   </pic:nvPicPr>
                   <pic:blipFill>
-                    <a:blip r:embed="rId4">
+                    <a:blip r:embed="rId5">
                       <a:extLst>
                         <a:ext uri="{96DAC541-7B7A-43D3-8B79-37D633B846F1}">
-                          <asvg:svgBlip xmlns:asvg="http://schemas.microsoft.com/office/drawing/2016/SVG/main" r:embed="rId5"/>
+                          <asvg:svgBlip xmlns:asvg="http://schemas.microsoft.com/office/drawing/2016/SVG/main" r:embed="rId6"/>
                         </a:ext>
                       </a:extLst>
                     </a:blip>
@@ -87,11 +83,6 @@
         </w:drawing>
       </w:r>
       <w:r>
-        <w:rPr>
-          <w:rFonts w:asciiTheme="majorHAnsi" w:hAnsiTheme="majorHAnsi"/>
-          <w:sz w:val="56"/>
-          <w:szCs w:val="56"/>
-        </w:rPr>
         <w:t>Instructions</w:t>
       </w:r>
     </w:p>
@@ -102,12 +93,756 @@
       <w:r>
         <w:br w:type="page"/>
       </w:r>
-      <w:proofErr w:type="spellStart"/>
       <w:r>
         <w:lastRenderedPageBreak/>
-        <w:t>asdasd</w:t>
+        <w:t>Details</w:t>
       </w:r>
-      <w:proofErr w:type="spellEnd"/>
+    </w:p>
+    <w:p>
+      <w:pPr>
+        <w:pStyle w:val="Subtitle"/>
+      </w:pPr>
+      <w:r>
+        <w:t>Features</w:t>
+      </w:r>
+    </w:p>
+    <w:p>
+      <w:pPr>
+        <w:numPr>
+          <w:ilvl w:val="0"/>
+          <w:numId w:val="2"/>
+        </w:numPr>
+        <w:spacing w:after="0"/>
+        <w:rPr>
+          <w:sz w:val="26"/>
+          <w:szCs w:val="26"/>
+        </w:rPr>
+      </w:pPr>
+      <w:r>
+        <w:rPr>
+          <w:sz w:val="26"/>
+          <w:szCs w:val="26"/>
+        </w:rPr>
+        <w:t xml:space="preserve">The clock is </w:t>
+      </w:r>
+      <w:r>
+        <w:rPr>
+          <w:b/>
+          <w:bCs/>
+          <w:i/>
+          <w:iCs/>
+          <w:sz w:val="26"/>
+          <w:szCs w:val="26"/>
+        </w:rPr>
+        <w:t>Wi-Fi enabled</w:t>
+      </w:r>
+      <w:r>
+        <w:rPr>
+          <w:sz w:val="26"/>
+          <w:szCs w:val="26"/>
+        </w:rPr>
+        <w:t xml:space="preserve">, so it's </w:t>
+      </w:r>
+      <w:r>
+        <w:rPr>
+          <w:b/>
+          <w:bCs/>
+          <w:i/>
+          <w:iCs/>
+          <w:sz w:val="26"/>
+          <w:szCs w:val="26"/>
+        </w:rPr>
+        <w:t>ALWAYS right</w:t>
+      </w:r>
+    </w:p>
+    <w:p>
+      <w:pPr>
+        <w:numPr>
+          <w:ilvl w:val="0"/>
+          <w:numId w:val="2"/>
+        </w:numPr>
+        <w:spacing w:after="0"/>
+        <w:rPr>
+          <w:sz w:val="26"/>
+          <w:szCs w:val="26"/>
+        </w:rPr>
+      </w:pPr>
+      <w:r>
+        <w:rPr>
+          <w:sz w:val="26"/>
+          <w:szCs w:val="26"/>
+        </w:rPr>
+        <w:t xml:space="preserve">Continuously monitors </w:t>
+      </w:r>
+      <w:r>
+        <w:rPr>
+          <w:b/>
+          <w:bCs/>
+          <w:i/>
+          <w:iCs/>
+          <w:sz w:val="26"/>
+          <w:szCs w:val="26"/>
+        </w:rPr>
+        <w:t>multiple network time servers</w:t>
+      </w:r>
+      <w:r>
+        <w:rPr>
+          <w:sz w:val="26"/>
+          <w:szCs w:val="26"/>
+        </w:rPr>
+        <w:t xml:space="preserve"> for redundancy</w:t>
+      </w:r>
+    </w:p>
+    <w:p>
+      <w:pPr>
+        <w:numPr>
+          <w:ilvl w:val="0"/>
+          <w:numId w:val="2"/>
+        </w:numPr>
+        <w:spacing w:after="0"/>
+        <w:rPr>
+          <w:sz w:val="26"/>
+          <w:szCs w:val="26"/>
+        </w:rPr>
+      </w:pPr>
+      <w:r>
+        <w:rPr>
+          <w:b/>
+          <w:bCs/>
+          <w:i/>
+          <w:iCs/>
+          <w:sz w:val="26"/>
+          <w:szCs w:val="26"/>
+        </w:rPr>
+        <w:t>Global timezone database</w:t>
+      </w:r>
+      <w:r>
+        <w:rPr>
+          <w:sz w:val="26"/>
+          <w:szCs w:val="26"/>
+        </w:rPr>
+        <w:t xml:space="preserve"> stores all Daylight Savings Times to the </w:t>
+      </w:r>
+      <w:r>
+        <w:rPr>
+          <w:sz w:val="26"/>
+          <w:szCs w:val="26"/>
+        </w:rPr>
+        <w:t xml:space="preserve">exact </w:t>
+      </w:r>
+      <w:r>
+        <w:rPr>
+          <w:sz w:val="26"/>
+          <w:szCs w:val="26"/>
+        </w:rPr>
+        <w:t>second</w:t>
+      </w:r>
+    </w:p>
+    <w:p>
+      <w:pPr>
+        <w:numPr>
+          <w:ilvl w:val="0"/>
+          <w:numId w:val="2"/>
+        </w:numPr>
+        <w:spacing w:after="0"/>
+        <w:rPr>
+          <w:sz w:val="26"/>
+          <w:szCs w:val="26"/>
+        </w:rPr>
+      </w:pPr>
+      <w:r>
+        <w:rPr>
+          <w:b/>
+          <w:bCs/>
+          <w:i/>
+          <w:iCs/>
+          <w:sz w:val="26"/>
+          <w:szCs w:val="26"/>
+        </w:rPr>
+        <w:t>Daylight savings time</w:t>
+      </w:r>
+      <w:r>
+        <w:rPr>
+          <w:sz w:val="26"/>
+          <w:szCs w:val="26"/>
+        </w:rPr>
+        <w:t xml:space="preserve"> is updated </w:t>
+      </w:r>
+      <w:r>
+        <w:rPr>
+          <w:sz w:val="26"/>
+          <w:szCs w:val="26"/>
+        </w:rPr>
+        <w:t xml:space="preserve">instantly </w:t>
+      </w:r>
+      <w:r>
+        <w:rPr>
+          <w:sz w:val="26"/>
+          <w:szCs w:val="26"/>
+        </w:rPr>
+        <w:t>at the correct millisecond</w:t>
+      </w:r>
+    </w:p>
+    <w:p>
+      <w:pPr>
+        <w:numPr>
+          <w:ilvl w:val="0"/>
+          <w:numId w:val="2"/>
+        </w:numPr>
+        <w:spacing w:after="0"/>
+        <w:rPr>
+          <w:sz w:val="26"/>
+          <w:szCs w:val="26"/>
+        </w:rPr>
+      </w:pPr>
+      <w:r>
+        <w:rPr>
+          <w:b/>
+          <w:bCs/>
+          <w:i/>
+          <w:iCs/>
+          <w:sz w:val="26"/>
+          <w:szCs w:val="26"/>
+        </w:rPr>
+        <w:t>Select timezone</w:t>
+      </w:r>
+      <w:r>
+        <w:rPr>
+          <w:sz w:val="26"/>
+          <w:szCs w:val="26"/>
+        </w:rPr>
+        <w:t xml:space="preserve"> manually or automatically </w:t>
+      </w:r>
+      <w:r>
+        <w:rPr>
+          <w:sz w:val="26"/>
+          <w:szCs w:val="26"/>
+        </w:rPr>
+        <w:t>(</w:t>
+      </w:r>
+      <w:r>
+        <w:rPr>
+          <w:sz w:val="26"/>
+          <w:szCs w:val="26"/>
+        </w:rPr>
+        <w:t>using Geo-IP database lookup</w:t>
+      </w:r>
+      <w:r>
+        <w:rPr>
+          <w:sz w:val="26"/>
+          <w:szCs w:val="26"/>
+        </w:rPr>
+        <w:t>)</w:t>
+      </w:r>
+    </w:p>
+    <w:p>
+      <w:pPr>
+        <w:numPr>
+          <w:ilvl w:val="0"/>
+          <w:numId w:val="2"/>
+        </w:numPr>
+        <w:spacing w:after="0"/>
+        <w:rPr>
+          <w:sz w:val="26"/>
+          <w:szCs w:val="26"/>
+        </w:rPr>
+      </w:pPr>
+      <w:r>
+        <w:rPr>
+          <w:b/>
+          <w:bCs/>
+          <w:i/>
+          <w:iCs/>
+          <w:sz w:val="26"/>
+          <w:szCs w:val="26"/>
+        </w:rPr>
+        <w:t>Bright LED display</w:t>
+      </w:r>
+      <w:r>
+        <w:rPr>
+          <w:sz w:val="26"/>
+          <w:szCs w:val="26"/>
+        </w:rPr>
+        <w:t xml:space="preserve"> is super visible even in direct sunlight</w:t>
+      </w:r>
+    </w:p>
+    <w:p>
+      <w:pPr>
+        <w:numPr>
+          <w:ilvl w:val="0"/>
+          <w:numId w:val="2"/>
+        </w:numPr>
+        <w:spacing w:after="0"/>
+        <w:rPr>
+          <w:sz w:val="26"/>
+          <w:szCs w:val="26"/>
+        </w:rPr>
+      </w:pPr>
+      <w:r>
+        <w:rPr>
+          <w:b/>
+          <w:bCs/>
+          <w:i/>
+          <w:iCs/>
+          <w:sz w:val="26"/>
+          <w:szCs w:val="26"/>
+        </w:rPr>
+        <w:t>Ambient light sensor</w:t>
+      </w:r>
+      <w:r>
+        <w:rPr>
+          <w:sz w:val="26"/>
+          <w:szCs w:val="26"/>
+        </w:rPr>
+        <w:t xml:space="preserve"> </w:t>
+      </w:r>
+      <w:r>
+        <w:rPr>
+          <w:sz w:val="26"/>
+          <w:szCs w:val="26"/>
+        </w:rPr>
+        <w:t xml:space="preserve">for auto </w:t>
+      </w:r>
+      <w:r>
+        <w:rPr>
+          <w:sz w:val="26"/>
+          <w:szCs w:val="26"/>
+        </w:rPr>
+        <w:t>brightness</w:t>
+      </w:r>
+    </w:p>
+    <w:p>
+      <w:pPr>
+        <w:numPr>
+          <w:ilvl w:val="0"/>
+          <w:numId w:val="2"/>
+        </w:numPr>
+        <w:spacing w:after="0"/>
+        <w:rPr>
+          <w:sz w:val="26"/>
+          <w:szCs w:val="26"/>
+        </w:rPr>
+      </w:pPr>
+      <w:r>
+        <w:rPr>
+          <w:b/>
+          <w:bCs/>
+          <w:i/>
+          <w:iCs/>
+          <w:sz w:val="26"/>
+          <w:szCs w:val="26"/>
+        </w:rPr>
+        <w:t>Fully configurable display</w:t>
+      </w:r>
+      <w:r>
+        <w:rPr>
+          <w:sz w:val="26"/>
+          <w:szCs w:val="26"/>
+        </w:rPr>
+        <w:t>: seconds, font, colon etc</w:t>
+      </w:r>
+    </w:p>
+    <w:p>
+      <w:pPr>
+        <w:numPr>
+          <w:ilvl w:val="0"/>
+          <w:numId w:val="2"/>
+        </w:numPr>
+        <w:spacing w:after="0"/>
+        <w:rPr>
+          <w:sz w:val="26"/>
+          <w:szCs w:val="26"/>
+        </w:rPr>
+      </w:pPr>
+      <w:r>
+        <w:rPr>
+          <w:sz w:val="26"/>
+          <w:szCs w:val="26"/>
+        </w:rPr>
+        <w:t xml:space="preserve">Wi-Fi provisioning via </w:t>
+      </w:r>
+      <w:r>
+        <w:rPr>
+          <w:b/>
+          <w:bCs/>
+          <w:i/>
+          <w:iCs/>
+          <w:sz w:val="26"/>
+          <w:szCs w:val="26"/>
+        </w:rPr>
+        <w:t>standard Espressif App</w:t>
+      </w:r>
+      <w:r>
+        <w:rPr>
+          <w:sz w:val="26"/>
+          <w:szCs w:val="26"/>
+        </w:rPr>
+        <w:t xml:space="preserve"> (ESP BLE Provisioning)</w:t>
+      </w:r>
+    </w:p>
+    <w:p>
+      <w:pPr>
+        <w:numPr>
+          <w:ilvl w:val="0"/>
+          <w:numId w:val="2"/>
+        </w:numPr>
+        <w:spacing w:after="0"/>
+        <w:rPr>
+          <w:sz w:val="26"/>
+          <w:szCs w:val="26"/>
+        </w:rPr>
+      </w:pPr>
+      <w:r>
+        <w:rPr>
+          <w:sz w:val="26"/>
+          <w:szCs w:val="26"/>
+        </w:rPr>
+        <w:t>Over-the-air firmware update capability</w:t>
+      </w:r>
+    </w:p>
+    <w:p>
+      <w:pPr>
+        <w:pStyle w:val="Subtitle"/>
+      </w:pPr>
+      <w:r>
+        <w:t>Dimensions</w:t>
+      </w:r>
+    </w:p>
+    <w:p>
+      <w:pPr>
+        <w:numPr>
+          <w:ilvl w:val="0"/>
+          <w:numId w:val="2"/>
+        </w:numPr>
+        <w:tabs>
+          <w:tab w:val="left" w:pos="1843"/>
+        </w:tabs>
+        <w:spacing w:after="0"/>
+        <w:rPr>
+          <w:sz w:val="26"/>
+          <w:szCs w:val="26"/>
+        </w:rPr>
+      </w:pPr>
+      <w:r>
+        <w:rPr>
+          <w:sz w:val="26"/>
+          <w:szCs w:val="26"/>
+        </w:rPr>
+        <w:t>Display</w:t>
+      </w:r>
+      <w:r>
+        <w:rPr>
+          <w:sz w:val="26"/>
+          <w:szCs w:val="26"/>
+        </w:rPr>
+        <w:tab/>
+      </w:r>
+      <w:r>
+        <w:rPr>
+          <w:sz w:val="26"/>
+          <w:szCs w:val="26"/>
+        </w:rPr>
+        <w:t>60mm diameter</w:t>
+      </w:r>
+    </w:p>
+    <w:p>
+      <w:pPr>
+        <w:numPr>
+          <w:ilvl w:val="0"/>
+          <w:numId w:val="2"/>
+        </w:numPr>
+        <w:tabs>
+          <w:tab w:val="left" w:pos="1843"/>
+        </w:tabs>
+        <w:spacing w:after="0"/>
+        <w:rPr>
+          <w:sz w:val="26"/>
+          <w:szCs w:val="26"/>
+        </w:rPr>
+      </w:pPr>
+      <w:r>
+        <w:rPr>
+          <w:sz w:val="26"/>
+          <w:szCs w:val="26"/>
+        </w:rPr>
+        <w:t>Digits</w:t>
+      </w:r>
+      <w:r>
+        <w:rPr>
+          <w:sz w:val="26"/>
+          <w:szCs w:val="26"/>
+        </w:rPr>
+        <w:tab/>
+      </w:r>
+      <w:r>
+        <w:rPr>
+          <w:sz w:val="26"/>
+          <w:szCs w:val="26"/>
+        </w:rPr>
+        <w:t>10mm high</w:t>
+      </w:r>
+    </w:p>
+    <w:p>
+      <w:pPr>
+        <w:numPr>
+          <w:ilvl w:val="0"/>
+          <w:numId w:val="2"/>
+        </w:numPr>
+        <w:tabs>
+          <w:tab w:val="left" w:pos="1843"/>
+        </w:tabs>
+        <w:spacing w:after="0"/>
+        <w:rPr>
+          <w:sz w:val="26"/>
+          <w:szCs w:val="26"/>
+        </w:rPr>
+      </w:pPr>
+      <w:r>
+        <w:rPr>
+          <w:sz w:val="26"/>
+          <w:szCs w:val="26"/>
+        </w:rPr>
+        <w:t>Body</w:t>
+      </w:r>
+      <w:r>
+        <w:rPr>
+          <w:sz w:val="26"/>
+          <w:szCs w:val="26"/>
+        </w:rPr>
+        <w:tab/>
+      </w:r>
+      <w:r>
+        <w:rPr>
+          <w:sz w:val="26"/>
+          <w:szCs w:val="26"/>
+        </w:rPr>
+        <w:t>63mm wide</w:t>
+      </w:r>
+      <w:r>
+        <w:rPr>
+          <w:sz w:val="26"/>
+          <w:szCs w:val="26"/>
+        </w:rPr>
+        <w:t>,</w:t>
+      </w:r>
+      <w:r>
+        <w:rPr>
+          <w:sz w:val="26"/>
+          <w:szCs w:val="26"/>
+        </w:rPr>
+        <w:t xml:space="preserve"> 84mm tall</w:t>
+      </w:r>
+      <w:r>
+        <w:rPr>
+          <w:sz w:val="26"/>
+          <w:szCs w:val="26"/>
+        </w:rPr>
+        <w:t>,</w:t>
+      </w:r>
+      <w:r>
+        <w:rPr>
+          <w:sz w:val="26"/>
+          <w:szCs w:val="26"/>
+        </w:rPr>
+        <w:t xml:space="preserve"> 9mm deep</w:t>
+      </w:r>
+    </w:p>
+    <w:p>
+      <w:pPr>
+        <w:pStyle w:val="Subtitle"/>
+      </w:pPr>
+      <w:r>
+        <w:t>Connectivity</w:t>
+      </w:r>
+    </w:p>
+    <w:p>
+      <w:pPr>
+        <w:numPr>
+          <w:ilvl w:val="0"/>
+          <w:numId w:val="2"/>
+        </w:numPr>
+        <w:spacing w:after="0"/>
+        <w:rPr>
+          <w:sz w:val="26"/>
+          <w:szCs w:val="26"/>
+        </w:rPr>
+      </w:pPr>
+      <w:r>
+        <w:rPr>
+          <w:sz w:val="26"/>
+          <w:szCs w:val="26"/>
+        </w:rPr>
+        <w:t>Wi-Fi (</w:t>
+      </w:r>
+      <w:r>
+        <w:rPr>
+          <w:sz w:val="26"/>
+          <w:szCs w:val="26"/>
+        </w:rPr>
+        <w:t>Global t</w:t>
+      </w:r>
+      <w:r>
+        <w:rPr>
+          <w:sz w:val="26"/>
+          <w:szCs w:val="26"/>
+        </w:rPr>
+        <w:t>ime</w:t>
+      </w:r>
+      <w:r>
+        <w:rPr>
+          <w:sz w:val="26"/>
+          <w:szCs w:val="26"/>
+        </w:rPr>
+        <w:t xml:space="preserve"> synchronization</w:t>
+      </w:r>
+      <w:r>
+        <w:rPr>
+          <w:sz w:val="26"/>
+          <w:szCs w:val="26"/>
+        </w:rPr>
+        <w:t>, firmware update)</w:t>
+      </w:r>
+    </w:p>
+    <w:p>
+      <w:pPr>
+        <w:numPr>
+          <w:ilvl w:val="0"/>
+          <w:numId w:val="2"/>
+        </w:numPr>
+        <w:spacing w:after="0"/>
+        <w:rPr>
+          <w:sz w:val="26"/>
+          <w:szCs w:val="26"/>
+        </w:rPr>
+      </w:pPr>
+      <w:r>
+        <w:rPr>
+          <w:sz w:val="26"/>
+          <w:szCs w:val="26"/>
+        </w:rPr>
+        <w:t>USB-C (Power, firmware update)</w:t>
+      </w:r>
+    </w:p>
+    <w:p>
+      <w:pPr>
+        <w:pStyle w:val="Subtitle"/>
+      </w:pPr>
+      <w:r>
+        <w:t>Power</w:t>
+      </w:r>
+    </w:p>
+    <w:p>
+      <w:pPr>
+        <w:pStyle w:val="ListParagraph"/>
+        <w:numPr>
+          <w:ilvl w:val="0"/>
+          <w:numId w:val="2"/>
+        </w:numPr>
+        <w:spacing w:after="0"/>
+        <w:rPr>
+          <w:sz w:val="26"/>
+          <w:szCs w:val="26"/>
+        </w:rPr>
+      </w:pPr>
+      <w:r>
+        <w:rPr>
+          <w:sz w:val="26"/>
+          <w:szCs w:val="26"/>
+        </w:rPr>
+        <w:t>USB 5V, 500mA</w:t>
+      </w:r>
+      <w:r>
+        <w:rPr>
+          <w:sz w:val="26"/>
+          <w:szCs w:val="26"/>
+        </w:rPr>
+        <w:br w:type="page"/>
+      </w:r>
+    </w:p>
+    <w:p>
+      <w:pPr>
+        <w:pStyle w:val="Heading1"/>
+      </w:pPr>
+      <w:r>
+        <w:lastRenderedPageBreak/>
+        <w:t>Buttons</w:t>
+      </w:r>
+    </w:p>
+    <w:p>
+      <w:r>
+        <w:t>There are 6 buttons…</w:t>
+      </w:r>
+    </w:p>
+    <w:p>
+      <w:pPr>
+        <w:pStyle w:val="ListParagraph"/>
+        <w:numPr>
+          <w:ilvl w:val="0"/>
+          <w:numId w:val="1"/>
+        </w:numPr>
+      </w:pPr>
+      <w:r>
+        <w:t>Reset – reset the clock</w:t>
+      </w:r>
+    </w:p>
+    <w:p>
+      <w:pPr>
+        <w:pStyle w:val="ListParagraph"/>
+        <w:numPr>
+          <w:ilvl w:val="0"/>
+          <w:numId w:val="1"/>
+        </w:numPr>
+      </w:pPr>
+      <w:r>
+        <w:t>Up/Down/Left/Right – Navigate menus</w:t>
+      </w:r>
+    </w:p>
+    <w:p>
+      <w:pPr>
+        <w:pStyle w:val="ListParagraph"/>
+        <w:numPr>
+          <w:ilvl w:val="0"/>
+          <w:numId w:val="1"/>
+        </w:numPr>
+      </w:pPr>
+      <w:r>
+        <w:t>Select – select menu item</w:t>
+      </w:r>
+    </w:p>
+    <w:p>
+      <w:pPr>
+        <w:pStyle w:val="ListParagraph"/>
+        <w:numPr>
+          <w:ilvl w:val="0"/>
+          <w:numId w:val="1"/>
+        </w:numPr>
+      </w:pPr>
+      <w:r>
+        <w:t xml:space="preserve">Hold any of Up/Down/Left/Right/Select while the </w:t>
+      </w:r>
+      <w:r>
+        <w:t>clock</w:t>
+      </w:r>
+      <w:r>
+        <w:t xml:space="preserve"> is reset or powering up to enter Factory Reset mode.</w:t>
+      </w:r>
+      <w:r>
+        <w:br w:type="page"/>
+      </w:r>
+    </w:p>
+    <w:p>
+      <w:pPr>
+        <w:pStyle w:val="Heading1"/>
+      </w:pPr>
+      <w:r>
+        <w:lastRenderedPageBreak/>
+        <w:t>Provisioning</w:t>
+      </w:r>
+    </w:p>
+    <w:p>
+      <w:r>
+        <w:t>To provision your device…</w:t>
+      </w:r>
     </w:p>
     <w:p>
       <w:pPr>
@@ -135,6 +870,11 @@
         <w:t>Menus</w:t>
       </w:r>
     </w:p>
+    <w:p>
+      <w:r>
+        <w:t>Press the Select key to activate the menu system.</w:t>
+      </w:r>
+    </w:p>
     <w:tbl>
       <w:tblPr>
         <w:tblW w:w="6789" w:type="dxa"/>
@@ -145,6 +885,7 @@
           <w:bottom w:val="single" w:sz="4" w:space="0" w:color="auto"/>
           <w:right w:val="single" w:sz="4" w:space="0" w:color="auto"/>
         </w:tblBorders>
+        <w:shd w:val="clear" w:color="auto" w:fill="FAFAFA"/>
         <w:tblLook w:val="04A0" w:firstRow="1" w:lastRow="0" w:firstColumn="1" w:lastColumn="0" w:noHBand="0" w:noVBand="1"/>
       </w:tblPr>
       <w:tblGrid>
@@ -163,7 +904,7 @@
         <w:tc>
           <w:tcPr>
             <w:tcW w:w="258" w:type="dxa"/>
-            <w:shd w:val="clear" w:color="000000" w:fill="F2F2F2"/>
+            <w:shd w:val="clear" w:color="auto" w:fill="FAFAFA"/>
             <w:noWrap/>
             <w:vAlign w:val="bottom"/>
             <w:hideMark/>
@@ -196,7 +937,7 @@
           <w:tcPr>
             <w:tcW w:w="2133" w:type="dxa"/>
             <w:gridSpan w:val="3"/>
-            <w:shd w:val="clear" w:color="000000" w:fill="F2F2F2"/>
+            <w:shd w:val="clear" w:color="auto" w:fill="FAFAFA"/>
             <w:noWrap/>
             <w:vAlign w:val="bottom"/>
             <w:hideMark/>
@@ -232,7 +973,7 @@
         <w:tc>
           <w:tcPr>
             <w:tcW w:w="4140" w:type="dxa"/>
-            <w:shd w:val="clear" w:color="000000" w:fill="F2F2F2"/>
+            <w:shd w:val="clear" w:color="auto" w:fill="FAFAFA"/>
             <w:noWrap/>
             <w:vAlign w:val="bottom"/>
             <w:hideMark/>
@@ -264,7 +1005,7 @@
         <w:tc>
           <w:tcPr>
             <w:tcW w:w="258" w:type="dxa"/>
-            <w:shd w:val="clear" w:color="000000" w:fill="F2F2F2"/>
+            <w:shd w:val="clear" w:color="auto" w:fill="FAFAFA"/>
             <w:noWrap/>
             <w:vAlign w:val="bottom"/>
             <w:hideMark/>
@@ -302,7 +1043,7 @@
         <w:tc>
           <w:tcPr>
             <w:tcW w:w="258" w:type="dxa"/>
-            <w:shd w:val="clear" w:color="000000" w:fill="F2F2F2"/>
+            <w:shd w:val="clear" w:color="auto" w:fill="FAFAFA"/>
             <w:noWrap/>
             <w:vAlign w:val="bottom"/>
             <w:hideMark/>
@@ -334,7 +1075,7 @@
         <w:tc>
           <w:tcPr>
             <w:tcW w:w="478" w:type="dxa"/>
-            <w:shd w:val="clear" w:color="000000" w:fill="F2F2F2"/>
+            <w:shd w:val="clear" w:color="auto" w:fill="FAFAFA"/>
             <w:noWrap/>
             <w:vAlign w:val="bottom"/>
             <w:hideMark/>
@@ -367,7 +1108,7 @@
           <w:tcPr>
             <w:tcW w:w="1655" w:type="dxa"/>
             <w:gridSpan w:val="2"/>
-            <w:shd w:val="clear" w:color="000000" w:fill="F2F2F2"/>
+            <w:shd w:val="clear" w:color="auto" w:fill="FAFAFA"/>
             <w:noWrap/>
             <w:vAlign w:val="bottom"/>
             <w:hideMark/>
@@ -399,7 +1140,7 @@
         <w:tc>
           <w:tcPr>
             <w:tcW w:w="4140" w:type="dxa"/>
-            <w:shd w:val="clear" w:color="000000" w:fill="F2F2F2"/>
+            <w:shd w:val="clear" w:color="auto" w:fill="FAFAFA"/>
             <w:noWrap/>
             <w:vAlign w:val="bottom"/>
             <w:hideMark/>
@@ -431,7 +1172,7 @@
         <w:tc>
           <w:tcPr>
             <w:tcW w:w="258" w:type="dxa"/>
-            <w:shd w:val="clear" w:color="000000" w:fill="F2F2F2"/>
+            <w:shd w:val="clear" w:color="auto" w:fill="FAFAFA"/>
             <w:noWrap/>
             <w:vAlign w:val="bottom"/>
             <w:hideMark/>
@@ -469,7 +1210,7 @@
         <w:tc>
           <w:tcPr>
             <w:tcW w:w="258" w:type="dxa"/>
-            <w:shd w:val="clear" w:color="000000" w:fill="F2F2F2"/>
+            <w:shd w:val="clear" w:color="auto" w:fill="FAFAFA"/>
             <w:noWrap/>
             <w:vAlign w:val="bottom"/>
             <w:hideMark/>
@@ -501,7 +1242,7 @@
         <w:tc>
           <w:tcPr>
             <w:tcW w:w="478" w:type="dxa"/>
-            <w:shd w:val="clear" w:color="000000" w:fill="F2F2F2"/>
+            <w:shd w:val="clear" w:color="auto" w:fill="FAFAFA"/>
             <w:noWrap/>
             <w:vAlign w:val="bottom"/>
             <w:hideMark/>
@@ -534,7 +1275,7 @@
           <w:tcPr>
             <w:tcW w:w="1655" w:type="dxa"/>
             <w:gridSpan w:val="2"/>
-            <w:shd w:val="clear" w:color="000000" w:fill="F2F2F2"/>
+            <w:shd w:val="clear" w:color="auto" w:fill="FAFAFA"/>
             <w:noWrap/>
             <w:vAlign w:val="bottom"/>
             <w:hideMark/>
@@ -566,7 +1307,7 @@
         <w:tc>
           <w:tcPr>
             <w:tcW w:w="4140" w:type="dxa"/>
-            <w:shd w:val="clear" w:color="000000" w:fill="F2F2F2"/>
+            <w:shd w:val="clear" w:color="auto" w:fill="FAFAFA"/>
             <w:noWrap/>
             <w:vAlign w:val="bottom"/>
             <w:hideMark/>
@@ -598,7 +1339,7 @@
         <w:tc>
           <w:tcPr>
             <w:tcW w:w="258" w:type="dxa"/>
-            <w:shd w:val="clear" w:color="000000" w:fill="F2F2F2"/>
+            <w:shd w:val="clear" w:color="auto" w:fill="FAFAFA"/>
             <w:noWrap/>
             <w:vAlign w:val="bottom"/>
             <w:hideMark/>
@@ -636,7 +1377,7 @@
         <w:tc>
           <w:tcPr>
             <w:tcW w:w="258" w:type="dxa"/>
-            <w:shd w:val="clear" w:color="000000" w:fill="F2F2F2"/>
+            <w:shd w:val="clear" w:color="auto" w:fill="FAFAFA"/>
             <w:noWrap/>
             <w:vAlign w:val="bottom"/>
             <w:hideMark/>
@@ -668,7 +1409,7 @@
         <w:tc>
           <w:tcPr>
             <w:tcW w:w="478" w:type="dxa"/>
-            <w:shd w:val="clear" w:color="000000" w:fill="F2F2F2"/>
+            <w:shd w:val="clear" w:color="auto" w:fill="FAFAFA"/>
             <w:noWrap/>
             <w:vAlign w:val="bottom"/>
             <w:hideMark/>
@@ -700,7 +1441,7 @@
         <w:tc>
           <w:tcPr>
             <w:tcW w:w="415" w:type="dxa"/>
-            <w:shd w:val="clear" w:color="000000" w:fill="F2F2F2"/>
+            <w:shd w:val="clear" w:color="auto" w:fill="FAFAFA"/>
             <w:noWrap/>
             <w:vAlign w:val="bottom"/>
             <w:hideMark/>
@@ -732,7 +1473,7 @@
         <w:tc>
           <w:tcPr>
             <w:tcW w:w="1240" w:type="dxa"/>
-            <w:shd w:val="clear" w:color="000000" w:fill="F2F2F2"/>
+            <w:shd w:val="clear" w:color="auto" w:fill="FAFAFA"/>
             <w:noWrap/>
             <w:vAlign w:val="bottom"/>
             <w:hideMark/>
@@ -764,7 +1505,7 @@
         <w:tc>
           <w:tcPr>
             <w:tcW w:w="4140" w:type="dxa"/>
-            <w:shd w:val="clear" w:color="000000" w:fill="F2F2F2"/>
+            <w:shd w:val="clear" w:color="auto" w:fill="FAFAFA"/>
             <w:noWrap/>
             <w:vAlign w:val="bottom"/>
             <w:hideMark/>
@@ -796,7 +1537,7 @@
         <w:tc>
           <w:tcPr>
             <w:tcW w:w="258" w:type="dxa"/>
-            <w:shd w:val="clear" w:color="000000" w:fill="F2F2F2"/>
+            <w:shd w:val="clear" w:color="auto" w:fill="FAFAFA"/>
             <w:noWrap/>
             <w:vAlign w:val="bottom"/>
             <w:hideMark/>
@@ -834,7 +1575,7 @@
         <w:tc>
           <w:tcPr>
             <w:tcW w:w="258" w:type="dxa"/>
-            <w:shd w:val="clear" w:color="000000" w:fill="F2F2F2"/>
+            <w:shd w:val="clear" w:color="auto" w:fill="FAFAFA"/>
             <w:noWrap/>
             <w:vAlign w:val="bottom"/>
             <w:hideMark/>
@@ -866,7 +1607,7 @@
         <w:tc>
           <w:tcPr>
             <w:tcW w:w="478" w:type="dxa"/>
-            <w:shd w:val="clear" w:color="000000" w:fill="F2F2F2"/>
+            <w:shd w:val="clear" w:color="auto" w:fill="FAFAFA"/>
             <w:noWrap/>
             <w:vAlign w:val="bottom"/>
             <w:hideMark/>
@@ -898,7 +1639,7 @@
         <w:tc>
           <w:tcPr>
             <w:tcW w:w="415" w:type="dxa"/>
-            <w:shd w:val="clear" w:color="000000" w:fill="F2F2F2"/>
+            <w:shd w:val="clear" w:color="auto" w:fill="FAFAFA"/>
             <w:noWrap/>
             <w:vAlign w:val="bottom"/>
             <w:hideMark/>
@@ -930,7 +1671,7 @@
         <w:tc>
           <w:tcPr>
             <w:tcW w:w="1240" w:type="dxa"/>
-            <w:shd w:val="clear" w:color="000000" w:fill="F2F2F2"/>
+            <w:shd w:val="clear" w:color="auto" w:fill="FAFAFA"/>
             <w:noWrap/>
             <w:vAlign w:val="bottom"/>
             <w:hideMark/>
@@ -962,7 +1703,7 @@
         <w:tc>
           <w:tcPr>
             <w:tcW w:w="4140" w:type="dxa"/>
-            <w:shd w:val="clear" w:color="000000" w:fill="F2F2F2"/>
+            <w:shd w:val="clear" w:color="auto" w:fill="FAFAFA"/>
             <w:noWrap/>
             <w:vAlign w:val="bottom"/>
             <w:hideMark/>
@@ -994,7 +1735,7 @@
         <w:tc>
           <w:tcPr>
             <w:tcW w:w="258" w:type="dxa"/>
-            <w:shd w:val="clear" w:color="000000" w:fill="F2F2F2"/>
+            <w:shd w:val="clear" w:color="auto" w:fill="FAFAFA"/>
             <w:noWrap/>
             <w:vAlign w:val="bottom"/>
             <w:hideMark/>
@@ -1032,7 +1773,7 @@
         <w:tc>
           <w:tcPr>
             <w:tcW w:w="258" w:type="dxa"/>
-            <w:shd w:val="clear" w:color="000000" w:fill="F2F2F2"/>
+            <w:shd w:val="clear" w:color="auto" w:fill="FAFAFA"/>
             <w:noWrap/>
             <w:vAlign w:val="bottom"/>
             <w:hideMark/>
@@ -1064,7 +1805,7 @@
         <w:tc>
           <w:tcPr>
             <w:tcW w:w="478" w:type="dxa"/>
-            <w:shd w:val="clear" w:color="000000" w:fill="F2F2F2"/>
+            <w:shd w:val="clear" w:color="auto" w:fill="FAFAFA"/>
             <w:noWrap/>
             <w:vAlign w:val="bottom"/>
             <w:hideMark/>
@@ -1097,7 +1838,7 @@
           <w:tcPr>
             <w:tcW w:w="1655" w:type="dxa"/>
             <w:gridSpan w:val="2"/>
-            <w:shd w:val="clear" w:color="000000" w:fill="F2F2F2"/>
+            <w:shd w:val="clear" w:color="auto" w:fill="FAFAFA"/>
             <w:noWrap/>
             <w:vAlign w:val="bottom"/>
             <w:hideMark/>
@@ -1129,7 +1870,7 @@
         <w:tc>
           <w:tcPr>
             <w:tcW w:w="4140" w:type="dxa"/>
-            <w:shd w:val="clear" w:color="000000" w:fill="F2F2F2"/>
+            <w:shd w:val="clear" w:color="auto" w:fill="FAFAFA"/>
             <w:noWrap/>
             <w:vAlign w:val="bottom"/>
             <w:hideMark/>
@@ -1161,7 +1902,7 @@
         <w:tc>
           <w:tcPr>
             <w:tcW w:w="258" w:type="dxa"/>
-            <w:shd w:val="clear" w:color="000000" w:fill="F2F2F2"/>
+            <w:shd w:val="clear" w:color="auto" w:fill="FAFAFA"/>
             <w:noWrap/>
             <w:vAlign w:val="bottom"/>
             <w:hideMark/>
@@ -1199,7 +1940,7 @@
         <w:tc>
           <w:tcPr>
             <w:tcW w:w="258" w:type="dxa"/>
-            <w:shd w:val="clear" w:color="000000" w:fill="F2F2F2"/>
+            <w:shd w:val="clear" w:color="auto" w:fill="FAFAFA"/>
             <w:noWrap/>
             <w:vAlign w:val="bottom"/>
             <w:hideMark/>
@@ -1231,7 +1972,7 @@
         <w:tc>
           <w:tcPr>
             <w:tcW w:w="478" w:type="dxa"/>
-            <w:shd w:val="clear" w:color="000000" w:fill="F2F2F2"/>
+            <w:shd w:val="clear" w:color="auto" w:fill="FAFAFA"/>
             <w:noWrap/>
             <w:vAlign w:val="bottom"/>
             <w:hideMark/>
@@ -1263,7 +2004,7 @@
         <w:tc>
           <w:tcPr>
             <w:tcW w:w="415" w:type="dxa"/>
-            <w:shd w:val="clear" w:color="000000" w:fill="F2F2F2"/>
+            <w:shd w:val="clear" w:color="auto" w:fill="FAFAFA"/>
             <w:noWrap/>
             <w:vAlign w:val="bottom"/>
             <w:hideMark/>
@@ -1295,7 +2036,7 @@
         <w:tc>
           <w:tcPr>
             <w:tcW w:w="1240" w:type="dxa"/>
-            <w:shd w:val="clear" w:color="000000" w:fill="F2F2F2"/>
+            <w:shd w:val="clear" w:color="auto" w:fill="FAFAFA"/>
             <w:noWrap/>
             <w:vAlign w:val="bottom"/>
             <w:hideMark/>
@@ -1327,7 +2068,7 @@
         <w:tc>
           <w:tcPr>
             <w:tcW w:w="4140" w:type="dxa"/>
-            <w:shd w:val="clear" w:color="000000" w:fill="F2F2F2"/>
+            <w:shd w:val="clear" w:color="auto" w:fill="FAFAFA"/>
             <w:noWrap/>
             <w:vAlign w:val="bottom"/>
             <w:hideMark/>
@@ -1359,7 +2100,7 @@
         <w:tc>
           <w:tcPr>
             <w:tcW w:w="258" w:type="dxa"/>
-            <w:shd w:val="clear" w:color="000000" w:fill="F2F2F2"/>
+            <w:shd w:val="clear" w:color="auto" w:fill="FAFAFA"/>
             <w:noWrap/>
             <w:vAlign w:val="bottom"/>
             <w:hideMark/>
@@ -1397,7 +2138,7 @@
         <w:tc>
           <w:tcPr>
             <w:tcW w:w="258" w:type="dxa"/>
-            <w:shd w:val="clear" w:color="000000" w:fill="F2F2F2"/>
+            <w:shd w:val="clear" w:color="auto" w:fill="FAFAFA"/>
             <w:noWrap/>
             <w:vAlign w:val="bottom"/>
             <w:hideMark/>
@@ -1429,7 +2170,7 @@
         <w:tc>
           <w:tcPr>
             <w:tcW w:w="478" w:type="dxa"/>
-            <w:shd w:val="clear" w:color="000000" w:fill="F2F2F2"/>
+            <w:shd w:val="clear" w:color="auto" w:fill="FAFAFA"/>
             <w:noWrap/>
             <w:vAlign w:val="bottom"/>
             <w:hideMark/>
@@ -1461,7 +2202,7 @@
         <w:tc>
           <w:tcPr>
             <w:tcW w:w="415" w:type="dxa"/>
-            <w:shd w:val="clear" w:color="000000" w:fill="F2F2F2"/>
+            <w:shd w:val="clear" w:color="auto" w:fill="FAFAFA"/>
             <w:noWrap/>
             <w:vAlign w:val="bottom"/>
             <w:hideMark/>
@@ -1493,7 +2234,7 @@
         <w:tc>
           <w:tcPr>
             <w:tcW w:w="1240" w:type="dxa"/>
-            <w:shd w:val="clear" w:color="000000" w:fill="F2F2F2"/>
+            <w:shd w:val="clear" w:color="auto" w:fill="FAFAFA"/>
             <w:noWrap/>
             <w:vAlign w:val="bottom"/>
             <w:hideMark/>
@@ -1525,7 +2266,7 @@
         <w:tc>
           <w:tcPr>
             <w:tcW w:w="4140" w:type="dxa"/>
-            <w:shd w:val="clear" w:color="000000" w:fill="F2F2F2"/>
+            <w:shd w:val="clear" w:color="auto" w:fill="FAFAFA"/>
             <w:noWrap/>
             <w:vAlign w:val="bottom"/>
             <w:hideMark/>
@@ -1557,7 +2298,7 @@
         <w:tc>
           <w:tcPr>
             <w:tcW w:w="258" w:type="dxa"/>
-            <w:shd w:val="clear" w:color="000000" w:fill="F2F2F2"/>
+            <w:shd w:val="clear" w:color="auto" w:fill="FAFAFA"/>
             <w:noWrap/>
             <w:vAlign w:val="bottom"/>
             <w:hideMark/>
@@ -1595,7 +2336,7 @@
         <w:tc>
           <w:tcPr>
             <w:tcW w:w="258" w:type="dxa"/>
-            <w:shd w:val="clear" w:color="000000" w:fill="F2F2F2"/>
+            <w:shd w:val="clear" w:color="auto" w:fill="FAFAFA"/>
             <w:noWrap/>
             <w:vAlign w:val="bottom"/>
             <w:hideMark/>
@@ -1627,7 +2368,7 @@
         <w:tc>
           <w:tcPr>
             <w:tcW w:w="478" w:type="dxa"/>
-            <w:shd w:val="clear" w:color="000000" w:fill="F2F2F2"/>
+            <w:shd w:val="clear" w:color="auto" w:fill="FAFAFA"/>
             <w:noWrap/>
             <w:vAlign w:val="bottom"/>
             <w:hideMark/>
@@ -1659,7 +2400,7 @@
         <w:tc>
           <w:tcPr>
             <w:tcW w:w="415" w:type="dxa"/>
-            <w:shd w:val="clear" w:color="000000" w:fill="F2F2F2"/>
+            <w:shd w:val="clear" w:color="auto" w:fill="FAFAFA"/>
             <w:noWrap/>
             <w:vAlign w:val="bottom"/>
             <w:hideMark/>
@@ -1691,7 +2432,7 @@
         <w:tc>
           <w:tcPr>
             <w:tcW w:w="1240" w:type="dxa"/>
-            <w:shd w:val="clear" w:color="000000" w:fill="F2F2F2"/>
+            <w:shd w:val="clear" w:color="auto" w:fill="FAFAFA"/>
             <w:noWrap/>
             <w:vAlign w:val="bottom"/>
             <w:hideMark/>
@@ -1723,7 +2464,7 @@
         <w:tc>
           <w:tcPr>
             <w:tcW w:w="4140" w:type="dxa"/>
-            <w:shd w:val="clear" w:color="000000" w:fill="F2F2F2"/>
+            <w:shd w:val="clear" w:color="auto" w:fill="FAFAFA"/>
             <w:noWrap/>
             <w:vAlign w:val="bottom"/>
             <w:hideMark/>
@@ -1755,7 +2496,7 @@
         <w:tc>
           <w:tcPr>
             <w:tcW w:w="258" w:type="dxa"/>
-            <w:shd w:val="clear" w:color="000000" w:fill="F2F2F2"/>
+            <w:shd w:val="clear" w:color="auto" w:fill="FAFAFA"/>
             <w:noWrap/>
             <w:vAlign w:val="bottom"/>
             <w:hideMark/>
@@ -1793,7 +2534,7 @@
         <w:tc>
           <w:tcPr>
             <w:tcW w:w="258" w:type="dxa"/>
-            <w:shd w:val="clear" w:color="000000" w:fill="F2F2F2"/>
+            <w:shd w:val="clear" w:color="auto" w:fill="FAFAFA"/>
             <w:noWrap/>
             <w:vAlign w:val="bottom"/>
             <w:hideMark/>
@@ -1825,7 +2566,7 @@
         <w:tc>
           <w:tcPr>
             <w:tcW w:w="478" w:type="dxa"/>
-            <w:shd w:val="clear" w:color="000000" w:fill="F2F2F2"/>
+            <w:shd w:val="clear" w:color="auto" w:fill="FAFAFA"/>
             <w:noWrap/>
             <w:vAlign w:val="bottom"/>
             <w:hideMark/>
@@ -1857,7 +2598,7 @@
         <w:tc>
           <w:tcPr>
             <w:tcW w:w="415" w:type="dxa"/>
-            <w:shd w:val="clear" w:color="000000" w:fill="F2F2F2"/>
+            <w:shd w:val="clear" w:color="auto" w:fill="FAFAFA"/>
             <w:noWrap/>
             <w:vAlign w:val="bottom"/>
             <w:hideMark/>
@@ -1889,7 +2630,7 @@
         <w:tc>
           <w:tcPr>
             <w:tcW w:w="1240" w:type="dxa"/>
-            <w:shd w:val="clear" w:color="000000" w:fill="F2F2F2"/>
+            <w:shd w:val="clear" w:color="auto" w:fill="FAFAFA"/>
             <w:noWrap/>
             <w:vAlign w:val="bottom"/>
             <w:hideMark/>
@@ -1921,7 +2662,7 @@
         <w:tc>
           <w:tcPr>
             <w:tcW w:w="4140" w:type="dxa"/>
-            <w:shd w:val="clear" w:color="000000" w:fill="F2F2F2"/>
+            <w:shd w:val="clear" w:color="auto" w:fill="FAFAFA"/>
             <w:noWrap/>
             <w:vAlign w:val="bottom"/>
             <w:hideMark/>
@@ -1953,7 +2694,7 @@
         <w:tc>
           <w:tcPr>
             <w:tcW w:w="258" w:type="dxa"/>
-            <w:shd w:val="clear" w:color="000000" w:fill="F2F2F2"/>
+            <w:shd w:val="clear" w:color="auto" w:fill="FAFAFA"/>
             <w:noWrap/>
             <w:vAlign w:val="bottom"/>
             <w:hideMark/>
@@ -1991,7 +2732,7 @@
         <w:tc>
           <w:tcPr>
             <w:tcW w:w="258" w:type="dxa"/>
-            <w:shd w:val="clear" w:color="000000" w:fill="F2F2F2"/>
+            <w:shd w:val="clear" w:color="auto" w:fill="FAFAFA"/>
             <w:noWrap/>
             <w:vAlign w:val="bottom"/>
             <w:hideMark/>
@@ -2023,7 +2764,7 @@
         <w:tc>
           <w:tcPr>
             <w:tcW w:w="478" w:type="dxa"/>
-            <w:shd w:val="clear" w:color="000000" w:fill="F2F2F2"/>
+            <w:shd w:val="clear" w:color="auto" w:fill="FAFAFA"/>
             <w:noWrap/>
             <w:vAlign w:val="bottom"/>
             <w:hideMark/>
@@ -2055,7 +2796,7 @@
         <w:tc>
           <w:tcPr>
             <w:tcW w:w="415" w:type="dxa"/>
-            <w:shd w:val="clear" w:color="000000" w:fill="F2F2F2"/>
+            <w:shd w:val="clear" w:color="auto" w:fill="FAFAFA"/>
             <w:noWrap/>
             <w:vAlign w:val="bottom"/>
             <w:hideMark/>
@@ -2087,7 +2828,7 @@
         <w:tc>
           <w:tcPr>
             <w:tcW w:w="1240" w:type="dxa"/>
-            <w:shd w:val="clear" w:color="000000" w:fill="F2F2F2"/>
+            <w:shd w:val="clear" w:color="auto" w:fill="FAFAFA"/>
             <w:noWrap/>
             <w:vAlign w:val="bottom"/>
             <w:hideMark/>
@@ -2119,7 +2860,7 @@
         <w:tc>
           <w:tcPr>
             <w:tcW w:w="4140" w:type="dxa"/>
-            <w:shd w:val="clear" w:color="000000" w:fill="F2F2F2"/>
+            <w:shd w:val="clear" w:color="auto" w:fill="FAFAFA"/>
             <w:noWrap/>
             <w:vAlign w:val="bottom"/>
             <w:hideMark/>
@@ -2151,7 +2892,7 @@
         <w:tc>
           <w:tcPr>
             <w:tcW w:w="258" w:type="dxa"/>
-            <w:shd w:val="clear" w:color="000000" w:fill="F2F2F2"/>
+            <w:shd w:val="clear" w:color="auto" w:fill="FAFAFA"/>
             <w:noWrap/>
             <w:vAlign w:val="bottom"/>
             <w:hideMark/>
@@ -2189,7 +2930,7 @@
         <w:tc>
           <w:tcPr>
             <w:tcW w:w="258" w:type="dxa"/>
-            <w:shd w:val="clear" w:color="000000" w:fill="F2F2F2"/>
+            <w:shd w:val="clear" w:color="auto" w:fill="FAFAFA"/>
             <w:noWrap/>
             <w:vAlign w:val="bottom"/>
             <w:hideMark/>
@@ -2221,7 +2962,7 @@
         <w:tc>
           <w:tcPr>
             <w:tcW w:w="478" w:type="dxa"/>
-            <w:shd w:val="clear" w:color="000000" w:fill="F2F2F2"/>
+            <w:shd w:val="clear" w:color="auto" w:fill="FAFAFA"/>
             <w:noWrap/>
             <w:vAlign w:val="bottom"/>
             <w:hideMark/>
@@ -2254,7 +2995,7 @@
           <w:tcPr>
             <w:tcW w:w="1655" w:type="dxa"/>
             <w:gridSpan w:val="2"/>
-            <w:shd w:val="clear" w:color="000000" w:fill="F2F2F2"/>
+            <w:shd w:val="clear" w:color="auto" w:fill="FAFAFA"/>
             <w:noWrap/>
             <w:vAlign w:val="bottom"/>
             <w:hideMark/>
@@ -2286,7 +3027,7 @@
         <w:tc>
           <w:tcPr>
             <w:tcW w:w="4140" w:type="dxa"/>
-            <w:shd w:val="clear" w:color="000000" w:fill="F2F2F2"/>
+            <w:shd w:val="clear" w:color="auto" w:fill="FAFAFA"/>
             <w:noWrap/>
             <w:vAlign w:val="bottom"/>
             <w:hideMark/>
@@ -2318,7 +3059,7 @@
         <w:tc>
           <w:tcPr>
             <w:tcW w:w="258" w:type="dxa"/>
-            <w:shd w:val="clear" w:color="000000" w:fill="F2F2F2"/>
+            <w:shd w:val="clear" w:color="auto" w:fill="FAFAFA"/>
             <w:noWrap/>
             <w:vAlign w:val="bottom"/>
             <w:hideMark/>
@@ -2356,7 +3097,7 @@
         <w:tc>
           <w:tcPr>
             <w:tcW w:w="258" w:type="dxa"/>
-            <w:shd w:val="clear" w:color="000000" w:fill="F2F2F2"/>
+            <w:shd w:val="clear" w:color="auto" w:fill="FAFAFA"/>
             <w:noWrap/>
             <w:vAlign w:val="bottom"/>
             <w:hideMark/>
@@ -2388,7 +3129,7 @@
         <w:tc>
           <w:tcPr>
             <w:tcW w:w="478" w:type="dxa"/>
-            <w:shd w:val="clear" w:color="000000" w:fill="F2F2F2"/>
+            <w:shd w:val="clear" w:color="auto" w:fill="FAFAFA"/>
             <w:noWrap/>
             <w:vAlign w:val="bottom"/>
             <w:hideMark/>
@@ -2420,7 +3161,7 @@
         <w:tc>
           <w:tcPr>
             <w:tcW w:w="415" w:type="dxa"/>
-            <w:shd w:val="clear" w:color="000000" w:fill="F2F2F2"/>
+            <w:shd w:val="clear" w:color="auto" w:fill="FAFAFA"/>
             <w:noWrap/>
             <w:vAlign w:val="bottom"/>
             <w:hideMark/>
@@ -2452,7 +3193,7 @@
         <w:tc>
           <w:tcPr>
             <w:tcW w:w="1240" w:type="dxa"/>
-            <w:shd w:val="clear" w:color="000000" w:fill="F2F2F2"/>
+            <w:shd w:val="clear" w:color="auto" w:fill="FAFAFA"/>
             <w:noWrap/>
             <w:vAlign w:val="bottom"/>
             <w:hideMark/>
@@ -2484,7 +3225,7 @@
         <w:tc>
           <w:tcPr>
             <w:tcW w:w="4140" w:type="dxa"/>
-            <w:shd w:val="clear" w:color="000000" w:fill="F2F2F2"/>
+            <w:shd w:val="clear" w:color="auto" w:fill="FAFAFA"/>
             <w:noWrap/>
             <w:vAlign w:val="bottom"/>
             <w:hideMark/>
@@ -2516,7 +3257,7 @@
         <w:tc>
           <w:tcPr>
             <w:tcW w:w="258" w:type="dxa"/>
-            <w:shd w:val="clear" w:color="000000" w:fill="F2F2F2"/>
+            <w:shd w:val="clear" w:color="auto" w:fill="FAFAFA"/>
             <w:noWrap/>
             <w:vAlign w:val="bottom"/>
             <w:hideMark/>
@@ -2554,7 +3295,7 @@
         <w:tc>
           <w:tcPr>
             <w:tcW w:w="258" w:type="dxa"/>
-            <w:shd w:val="clear" w:color="000000" w:fill="F2F2F2"/>
+            <w:shd w:val="clear" w:color="auto" w:fill="FAFAFA"/>
             <w:noWrap/>
             <w:vAlign w:val="bottom"/>
             <w:hideMark/>
@@ -2586,7 +3327,7 @@
         <w:tc>
           <w:tcPr>
             <w:tcW w:w="478" w:type="dxa"/>
-            <w:shd w:val="clear" w:color="000000" w:fill="F2F2F2"/>
+            <w:shd w:val="clear" w:color="auto" w:fill="FAFAFA"/>
             <w:noWrap/>
             <w:vAlign w:val="bottom"/>
             <w:hideMark/>
@@ -2618,7 +3359,7 @@
         <w:tc>
           <w:tcPr>
             <w:tcW w:w="415" w:type="dxa"/>
-            <w:shd w:val="clear" w:color="000000" w:fill="F2F2F2"/>
+            <w:shd w:val="clear" w:color="auto" w:fill="FAFAFA"/>
             <w:noWrap/>
             <w:vAlign w:val="bottom"/>
             <w:hideMark/>
@@ -2650,7 +3391,7 @@
         <w:tc>
           <w:tcPr>
             <w:tcW w:w="1240" w:type="dxa"/>
-            <w:shd w:val="clear" w:color="000000" w:fill="F2F2F2"/>
+            <w:shd w:val="clear" w:color="auto" w:fill="FAFAFA"/>
             <w:noWrap/>
             <w:vAlign w:val="bottom"/>
             <w:hideMark/>
@@ -2682,7 +3423,7 @@
         <w:tc>
           <w:tcPr>
             <w:tcW w:w="4140" w:type="dxa"/>
-            <w:shd w:val="clear" w:color="000000" w:fill="F2F2F2"/>
+            <w:shd w:val="clear" w:color="auto" w:fill="FAFAFA"/>
             <w:noWrap/>
             <w:vAlign w:val="bottom"/>
             <w:hideMark/>
@@ -2714,7 +3455,7 @@
         <w:tc>
           <w:tcPr>
             <w:tcW w:w="258" w:type="dxa"/>
-            <w:shd w:val="clear" w:color="000000" w:fill="F2F2F2"/>
+            <w:shd w:val="clear" w:color="auto" w:fill="FAFAFA"/>
             <w:noWrap/>
             <w:vAlign w:val="bottom"/>
             <w:hideMark/>
@@ -2752,7 +3493,7 @@
         <w:tc>
           <w:tcPr>
             <w:tcW w:w="258" w:type="dxa"/>
-            <w:shd w:val="clear" w:color="000000" w:fill="F2F2F2"/>
+            <w:shd w:val="clear" w:color="auto" w:fill="FAFAFA"/>
             <w:noWrap/>
             <w:vAlign w:val="bottom"/>
             <w:hideMark/>
@@ -2784,7 +3525,7 @@
         <w:tc>
           <w:tcPr>
             <w:tcW w:w="478" w:type="dxa"/>
-            <w:shd w:val="clear" w:color="000000" w:fill="F2F2F2"/>
+            <w:shd w:val="clear" w:color="auto" w:fill="FAFAFA"/>
             <w:noWrap/>
             <w:vAlign w:val="bottom"/>
             <w:hideMark/>
@@ -2816,7 +3557,7 @@
         <w:tc>
           <w:tcPr>
             <w:tcW w:w="415" w:type="dxa"/>
-            <w:shd w:val="clear" w:color="000000" w:fill="F2F2F2"/>
+            <w:shd w:val="clear" w:color="auto" w:fill="FAFAFA"/>
             <w:noWrap/>
             <w:vAlign w:val="bottom"/>
             <w:hideMark/>
@@ -2848,7 +3589,7 @@
         <w:tc>
           <w:tcPr>
             <w:tcW w:w="1240" w:type="dxa"/>
-            <w:shd w:val="clear" w:color="000000" w:fill="F2F2F2"/>
+            <w:shd w:val="clear" w:color="auto" w:fill="FAFAFA"/>
             <w:noWrap/>
             <w:vAlign w:val="bottom"/>
             <w:hideMark/>
@@ -2880,7 +3621,7 @@
         <w:tc>
           <w:tcPr>
             <w:tcW w:w="4140" w:type="dxa"/>
-            <w:shd w:val="clear" w:color="000000" w:fill="F2F2F2"/>
+            <w:shd w:val="clear" w:color="auto" w:fill="FAFAFA"/>
             <w:noWrap/>
             <w:vAlign w:val="bottom"/>
             <w:hideMark/>
@@ -2912,7 +3653,7 @@
         <w:tc>
           <w:tcPr>
             <w:tcW w:w="258" w:type="dxa"/>
-            <w:shd w:val="clear" w:color="000000" w:fill="F2F2F2"/>
+            <w:shd w:val="clear" w:color="auto" w:fill="FAFAFA"/>
             <w:noWrap/>
             <w:vAlign w:val="bottom"/>
             <w:hideMark/>
@@ -2950,7 +3691,7 @@
         <w:tc>
           <w:tcPr>
             <w:tcW w:w="258" w:type="dxa"/>
-            <w:shd w:val="clear" w:color="000000" w:fill="F2F2F2"/>
+            <w:shd w:val="clear" w:color="auto" w:fill="FAFAFA"/>
             <w:noWrap/>
             <w:vAlign w:val="bottom"/>
             <w:hideMark/>
@@ -2982,7 +3723,7 @@
         <w:tc>
           <w:tcPr>
             <w:tcW w:w="478" w:type="dxa"/>
-            <w:shd w:val="clear" w:color="000000" w:fill="F2F2F2"/>
+            <w:shd w:val="clear" w:color="auto" w:fill="FAFAFA"/>
             <w:noWrap/>
             <w:vAlign w:val="bottom"/>
             <w:hideMark/>
@@ -3014,7 +3755,7 @@
         <w:tc>
           <w:tcPr>
             <w:tcW w:w="415" w:type="dxa"/>
-            <w:shd w:val="clear" w:color="000000" w:fill="F2F2F2"/>
+            <w:shd w:val="clear" w:color="auto" w:fill="FAFAFA"/>
             <w:noWrap/>
             <w:vAlign w:val="bottom"/>
             <w:hideMark/>
@@ -3046,7 +3787,7 @@
         <w:tc>
           <w:tcPr>
             <w:tcW w:w="1240" w:type="dxa"/>
-            <w:shd w:val="clear" w:color="000000" w:fill="F2F2F2"/>
+            <w:shd w:val="clear" w:color="auto" w:fill="FAFAFA"/>
             <w:noWrap/>
             <w:vAlign w:val="bottom"/>
             <w:hideMark/>
@@ -3078,7 +3819,7 @@
         <w:tc>
           <w:tcPr>
             <w:tcW w:w="4140" w:type="dxa"/>
-            <w:shd w:val="clear" w:color="000000" w:fill="F2F2F2"/>
+            <w:shd w:val="clear" w:color="auto" w:fill="FAFAFA"/>
             <w:noWrap/>
             <w:vAlign w:val="bottom"/>
             <w:hideMark/>
@@ -3110,7 +3851,7 @@
         <w:tc>
           <w:tcPr>
             <w:tcW w:w="258" w:type="dxa"/>
-            <w:shd w:val="clear" w:color="000000" w:fill="F2F2F2"/>
+            <w:shd w:val="clear" w:color="auto" w:fill="FAFAFA"/>
             <w:noWrap/>
             <w:vAlign w:val="bottom"/>
             <w:hideMark/>
@@ -3148,7 +3889,7 @@
         <w:tc>
           <w:tcPr>
             <w:tcW w:w="258" w:type="dxa"/>
-            <w:shd w:val="clear" w:color="000000" w:fill="F2F2F2"/>
+            <w:shd w:val="clear" w:color="auto" w:fill="FAFAFA"/>
             <w:noWrap/>
             <w:vAlign w:val="bottom"/>
             <w:hideMark/>
@@ -3180,7 +3921,7 @@
         <w:tc>
           <w:tcPr>
             <w:tcW w:w="478" w:type="dxa"/>
-            <w:shd w:val="clear" w:color="000000" w:fill="F2F2F2"/>
+            <w:shd w:val="clear" w:color="auto" w:fill="FAFAFA"/>
             <w:noWrap/>
             <w:vAlign w:val="bottom"/>
             <w:hideMark/>
@@ -3213,7 +3954,7 @@
           <w:tcPr>
             <w:tcW w:w="1655" w:type="dxa"/>
             <w:gridSpan w:val="2"/>
-            <w:shd w:val="clear" w:color="000000" w:fill="F2F2F2"/>
+            <w:shd w:val="clear" w:color="auto" w:fill="FAFAFA"/>
             <w:noWrap/>
             <w:vAlign w:val="bottom"/>
             <w:hideMark/>
@@ -3245,39 +3986,49 @@
         <w:tc>
           <w:tcPr>
             <w:tcW w:w="4140" w:type="dxa"/>
-            <w:shd w:val="clear" w:color="000000" w:fill="F2F2F2"/>
-            <w:noWrap/>
-            <w:vAlign w:val="bottom"/>
-            <w:hideMark/>
-          </w:tcPr>
-          <w:p>
-            <w:pPr>
-              <w:spacing w:after="0" w:line="240" w:lineRule="auto"/>
-              <w:contextualSpacing/>
-              <w:rPr>
-                <w:rFonts w:ascii="Aptos Narrow" w:eastAsia="Times New Roman" w:hAnsi="Aptos Narrow" w:cs="Times New Roman"/>
-                <w:color w:val="000000"/>
-                <w:kern w:val="0"/>
-                <w:lang w:eastAsia="en-GB"/>
-                <w14:ligatures w14:val="none"/>
-              </w:rPr>
-            </w:pPr>
-            <w:r>
-              <w:rPr>
-                <w:rFonts w:ascii="Aptos Narrow" w:eastAsia="Times New Roman" w:hAnsi="Aptos Narrow" w:cs="Times New Roman"/>
-                <w:color w:val="000000"/>
-                <w:kern w:val="0"/>
-                <w:lang w:eastAsia="en-GB"/>
-                <w14:ligatures w14:val="none"/>
-              </w:rPr>
-              <w:t>Choose clock time font Normal/Modern</w:t>
+            <w:shd w:val="clear" w:color="auto" w:fill="FAFAFA"/>
+            <w:noWrap/>
+            <w:vAlign w:val="bottom"/>
+            <w:hideMark/>
+          </w:tcPr>
+          <w:p>
+            <w:pPr>
+              <w:spacing w:after="0" w:line="240" w:lineRule="auto"/>
+              <w:contextualSpacing/>
+              <w:rPr>
+                <w:rFonts w:ascii="Aptos Narrow" w:eastAsia="Times New Roman" w:hAnsi="Aptos Narrow" w:cs="Times New Roman"/>
+                <w:color w:val="000000"/>
+                <w:kern w:val="0"/>
+                <w:lang w:eastAsia="en-GB"/>
+                <w14:ligatures w14:val="none"/>
+              </w:rPr>
+            </w:pPr>
+            <w:r>
+              <w:rPr>
+                <w:rFonts w:ascii="Aptos Narrow" w:eastAsia="Times New Roman" w:hAnsi="Aptos Narrow" w:cs="Times New Roman"/>
+                <w:color w:val="000000"/>
+                <w:kern w:val="0"/>
+                <w:lang w:eastAsia="en-GB"/>
+                <w14:ligatures w14:val="none"/>
+              </w:rPr>
+              <w:t>Choose clock time font Normal/</w:t>
+            </w:r>
+            <w:r>
+              <w:rPr>
+                <w:rFonts w:ascii="Aptos Narrow" w:eastAsia="Times New Roman" w:hAnsi="Aptos Narrow" w:cs="Times New Roman"/>
+                <w:color w:val="000000"/>
+                <w:kern w:val="0"/>
+                <w:lang w:eastAsia="en-GB"/>
+                <w14:ligatures w14:val="none"/>
+              </w:rPr>
+              <w:t>Square</w:t>
             </w:r>
           </w:p>
         </w:tc>
         <w:tc>
           <w:tcPr>
             <w:tcW w:w="258" w:type="dxa"/>
-            <w:shd w:val="clear" w:color="000000" w:fill="F2F2F2"/>
+            <w:shd w:val="clear" w:color="auto" w:fill="FAFAFA"/>
             <w:noWrap/>
             <w:vAlign w:val="bottom"/>
             <w:hideMark/>
@@ -3315,7 +4066,7 @@
         <w:tc>
           <w:tcPr>
             <w:tcW w:w="258" w:type="dxa"/>
-            <w:shd w:val="clear" w:color="000000" w:fill="F2F2F2"/>
+            <w:shd w:val="clear" w:color="auto" w:fill="FAFAFA"/>
             <w:noWrap/>
             <w:vAlign w:val="bottom"/>
             <w:hideMark/>
@@ -3347,7 +4098,7 @@
         <w:tc>
           <w:tcPr>
             <w:tcW w:w="478" w:type="dxa"/>
-            <w:shd w:val="clear" w:color="000000" w:fill="F2F2F2"/>
+            <w:shd w:val="clear" w:color="auto" w:fill="FAFAFA"/>
             <w:noWrap/>
             <w:vAlign w:val="bottom"/>
             <w:hideMark/>
@@ -3380,7 +4131,7 @@
           <w:tcPr>
             <w:tcW w:w="1655" w:type="dxa"/>
             <w:gridSpan w:val="2"/>
-            <w:shd w:val="clear" w:color="000000" w:fill="F2F2F2"/>
+            <w:shd w:val="clear" w:color="auto" w:fill="FAFAFA"/>
             <w:noWrap/>
             <w:vAlign w:val="bottom"/>
             <w:hideMark/>
@@ -3412,7 +4163,7 @@
         <w:tc>
           <w:tcPr>
             <w:tcW w:w="4140" w:type="dxa"/>
-            <w:shd w:val="clear" w:color="000000" w:fill="F2F2F2"/>
+            <w:shd w:val="clear" w:color="auto" w:fill="FAFAFA"/>
             <w:noWrap/>
             <w:vAlign w:val="bottom"/>
             <w:hideMark/>
@@ -3444,7 +4195,7 @@
         <w:tc>
           <w:tcPr>
             <w:tcW w:w="258" w:type="dxa"/>
-            <w:shd w:val="clear" w:color="000000" w:fill="F2F2F2"/>
+            <w:shd w:val="clear" w:color="auto" w:fill="FAFAFA"/>
             <w:noWrap/>
             <w:vAlign w:val="bottom"/>
             <w:hideMark/>
@@ -3482,7 +4233,7 @@
         <w:tc>
           <w:tcPr>
             <w:tcW w:w="258" w:type="dxa"/>
-            <w:shd w:val="clear" w:color="000000" w:fill="F2F2F2"/>
+            <w:shd w:val="clear" w:color="auto" w:fill="FAFAFA"/>
             <w:noWrap/>
             <w:vAlign w:val="bottom"/>
             <w:hideMark/>
@@ -3514,7 +4265,7 @@
         <w:tc>
           <w:tcPr>
             <w:tcW w:w="478" w:type="dxa"/>
-            <w:shd w:val="clear" w:color="000000" w:fill="F2F2F2"/>
+            <w:shd w:val="clear" w:color="auto" w:fill="FAFAFA"/>
             <w:noWrap/>
             <w:vAlign w:val="bottom"/>
             <w:hideMark/>
@@ -3546,7 +4297,7 @@
         <w:tc>
           <w:tcPr>
             <w:tcW w:w="415" w:type="dxa"/>
-            <w:shd w:val="clear" w:color="000000" w:fill="F2F2F2"/>
+            <w:shd w:val="clear" w:color="auto" w:fill="FAFAFA"/>
             <w:noWrap/>
             <w:vAlign w:val="bottom"/>
             <w:hideMark/>
@@ -3578,7 +4329,7 @@
         <w:tc>
           <w:tcPr>
             <w:tcW w:w="1240" w:type="dxa"/>
-            <w:shd w:val="clear" w:color="000000" w:fill="F2F2F2"/>
+            <w:shd w:val="clear" w:color="auto" w:fill="FAFAFA"/>
             <w:noWrap/>
             <w:vAlign w:val="bottom"/>
             <w:hideMark/>
@@ -3610,7 +4361,7 @@
         <w:tc>
           <w:tcPr>
             <w:tcW w:w="4140" w:type="dxa"/>
-            <w:shd w:val="clear" w:color="000000" w:fill="F2F2F2"/>
+            <w:shd w:val="clear" w:color="auto" w:fill="FAFAFA"/>
             <w:noWrap/>
             <w:vAlign w:val="bottom"/>
             <w:hideMark/>
@@ -3642,7 +4393,7 @@
         <w:tc>
           <w:tcPr>
             <w:tcW w:w="258" w:type="dxa"/>
-            <w:shd w:val="clear" w:color="000000" w:fill="F2F2F2"/>
+            <w:shd w:val="clear" w:color="auto" w:fill="FAFAFA"/>
             <w:noWrap/>
             <w:vAlign w:val="bottom"/>
             <w:hideMark/>
@@ -3680,7 +4431,7 @@
         <w:tc>
           <w:tcPr>
             <w:tcW w:w="258" w:type="dxa"/>
-            <w:shd w:val="clear" w:color="000000" w:fill="F2F2F2"/>
+            <w:shd w:val="clear" w:color="auto" w:fill="FAFAFA"/>
             <w:noWrap/>
             <w:vAlign w:val="bottom"/>
             <w:hideMark/>
@@ -3712,7 +4463,7 @@
         <w:tc>
           <w:tcPr>
             <w:tcW w:w="478" w:type="dxa"/>
-            <w:shd w:val="clear" w:color="000000" w:fill="F2F2F2"/>
+            <w:shd w:val="clear" w:color="auto" w:fill="FAFAFA"/>
             <w:noWrap/>
             <w:vAlign w:val="bottom"/>
             <w:hideMark/>
@@ -3744,7 +4495,7 @@
         <w:tc>
           <w:tcPr>
             <w:tcW w:w="415" w:type="dxa"/>
-            <w:shd w:val="clear" w:color="000000" w:fill="F2F2F2"/>
+            <w:shd w:val="clear" w:color="auto" w:fill="FAFAFA"/>
             <w:noWrap/>
             <w:vAlign w:val="bottom"/>
             <w:hideMark/>
@@ -3776,7 +4527,7 @@
         <w:tc>
           <w:tcPr>
             <w:tcW w:w="1240" w:type="dxa"/>
-            <w:shd w:val="clear" w:color="000000" w:fill="F2F2F2"/>
+            <w:shd w:val="clear" w:color="auto" w:fill="FAFAFA"/>
             <w:noWrap/>
             <w:vAlign w:val="bottom"/>
             <w:hideMark/>
@@ -3808,7 +4559,7 @@
         <w:tc>
           <w:tcPr>
             <w:tcW w:w="4140" w:type="dxa"/>
-            <w:shd w:val="clear" w:color="000000" w:fill="F2F2F2"/>
+            <w:shd w:val="clear" w:color="auto" w:fill="FAFAFA"/>
             <w:noWrap/>
             <w:vAlign w:val="bottom"/>
             <w:hideMark/>
@@ -3840,7 +4591,7 @@
         <w:tc>
           <w:tcPr>
             <w:tcW w:w="258" w:type="dxa"/>
-            <w:shd w:val="clear" w:color="000000" w:fill="F2F2F2"/>
+            <w:shd w:val="clear" w:color="auto" w:fill="FAFAFA"/>
             <w:noWrap/>
             <w:vAlign w:val="bottom"/>
             <w:hideMark/>
@@ -3878,7 +4629,7 @@
         <w:tc>
           <w:tcPr>
             <w:tcW w:w="258" w:type="dxa"/>
-            <w:shd w:val="clear" w:color="000000" w:fill="F2F2F2"/>
+            <w:shd w:val="clear" w:color="auto" w:fill="FAFAFA"/>
             <w:noWrap/>
             <w:vAlign w:val="bottom"/>
             <w:hideMark/>
@@ -3910,7 +4661,7 @@
         <w:tc>
           <w:tcPr>
             <w:tcW w:w="478" w:type="dxa"/>
-            <w:shd w:val="clear" w:color="000000" w:fill="F2F2F2"/>
+            <w:shd w:val="clear" w:color="auto" w:fill="FAFAFA"/>
             <w:noWrap/>
             <w:vAlign w:val="bottom"/>
             <w:hideMark/>
@@ -3942,7 +4693,7 @@
         <w:tc>
           <w:tcPr>
             <w:tcW w:w="415" w:type="dxa"/>
-            <w:shd w:val="clear" w:color="000000" w:fill="F2F2F2"/>
+            <w:shd w:val="clear" w:color="auto" w:fill="FAFAFA"/>
             <w:noWrap/>
             <w:vAlign w:val="bottom"/>
             <w:hideMark/>
@@ -3974,7 +4725,7 @@
         <w:tc>
           <w:tcPr>
             <w:tcW w:w="1240" w:type="dxa"/>
-            <w:shd w:val="clear" w:color="000000" w:fill="F2F2F2"/>
+            <w:shd w:val="clear" w:color="auto" w:fill="FAFAFA"/>
             <w:noWrap/>
             <w:vAlign w:val="bottom"/>
             <w:hideMark/>
@@ -4006,7 +4757,7 @@
         <w:tc>
           <w:tcPr>
             <w:tcW w:w="4140" w:type="dxa"/>
-            <w:shd w:val="clear" w:color="000000" w:fill="F2F2F2"/>
+            <w:shd w:val="clear" w:color="auto" w:fill="FAFAFA"/>
             <w:noWrap/>
             <w:vAlign w:val="bottom"/>
             <w:hideMark/>
@@ -4038,7 +4789,7 @@
         <w:tc>
           <w:tcPr>
             <w:tcW w:w="258" w:type="dxa"/>
-            <w:shd w:val="clear" w:color="000000" w:fill="F2F2F2"/>
+            <w:shd w:val="clear" w:color="auto" w:fill="FAFAFA"/>
             <w:noWrap/>
             <w:vAlign w:val="bottom"/>
             <w:hideMark/>
@@ -4076,7 +4827,7 @@
         <w:tc>
           <w:tcPr>
             <w:tcW w:w="258" w:type="dxa"/>
-            <w:shd w:val="clear" w:color="000000" w:fill="F2F2F2"/>
+            <w:shd w:val="clear" w:color="auto" w:fill="FAFAFA"/>
             <w:noWrap/>
             <w:vAlign w:val="bottom"/>
             <w:hideMark/>
@@ -4108,7 +4859,7 @@
         <w:tc>
           <w:tcPr>
             <w:tcW w:w="478" w:type="dxa"/>
-            <w:shd w:val="clear" w:color="000000" w:fill="F2F2F2"/>
+            <w:shd w:val="clear" w:color="auto" w:fill="FAFAFA"/>
             <w:noWrap/>
             <w:vAlign w:val="bottom"/>
             <w:hideMark/>
@@ -4140,7 +4891,7 @@
         <w:tc>
           <w:tcPr>
             <w:tcW w:w="415" w:type="dxa"/>
-            <w:shd w:val="clear" w:color="000000" w:fill="F2F2F2"/>
+            <w:shd w:val="clear" w:color="auto" w:fill="FAFAFA"/>
             <w:noWrap/>
             <w:vAlign w:val="bottom"/>
             <w:hideMark/>
@@ -4172,7 +4923,7 @@
         <w:tc>
           <w:tcPr>
             <w:tcW w:w="1240" w:type="dxa"/>
-            <w:shd w:val="clear" w:color="000000" w:fill="F2F2F2"/>
+            <w:shd w:val="clear" w:color="auto" w:fill="FAFAFA"/>
             <w:noWrap/>
             <w:vAlign w:val="bottom"/>
             <w:hideMark/>
@@ -4204,7 +4955,7 @@
         <w:tc>
           <w:tcPr>
             <w:tcW w:w="4140" w:type="dxa"/>
-            <w:shd w:val="clear" w:color="000000" w:fill="F2F2F2"/>
+            <w:shd w:val="clear" w:color="auto" w:fill="FAFAFA"/>
             <w:noWrap/>
             <w:vAlign w:val="bottom"/>
             <w:hideMark/>
@@ -4236,7 +4987,7 @@
         <w:tc>
           <w:tcPr>
             <w:tcW w:w="258" w:type="dxa"/>
-            <w:shd w:val="clear" w:color="000000" w:fill="F2F2F2"/>
+            <w:shd w:val="clear" w:color="auto" w:fill="FAFAFA"/>
             <w:noWrap/>
             <w:vAlign w:val="bottom"/>
             <w:hideMark/>
@@ -4274,7 +5025,7 @@
         <w:tc>
           <w:tcPr>
             <w:tcW w:w="258" w:type="dxa"/>
-            <w:shd w:val="clear" w:color="000000" w:fill="F2F2F2"/>
+            <w:shd w:val="clear" w:color="auto" w:fill="FAFAFA"/>
             <w:noWrap/>
             <w:vAlign w:val="bottom"/>
             <w:hideMark/>
@@ -4307,7 +5058,7 @@
           <w:tcPr>
             <w:tcW w:w="2133" w:type="dxa"/>
             <w:gridSpan w:val="3"/>
-            <w:shd w:val="clear" w:color="000000" w:fill="F2F2F2"/>
+            <w:shd w:val="clear" w:color="auto" w:fill="FAFAFA"/>
             <w:noWrap/>
             <w:vAlign w:val="bottom"/>
             <w:hideMark/>
@@ -4343,7 +5094,7 @@
         <w:tc>
           <w:tcPr>
             <w:tcW w:w="4140" w:type="dxa"/>
-            <w:shd w:val="clear" w:color="000000" w:fill="F2F2F2"/>
+            <w:shd w:val="clear" w:color="auto" w:fill="FAFAFA"/>
             <w:noWrap/>
             <w:vAlign w:val="bottom"/>
             <w:hideMark/>
@@ -4375,7 +5126,7 @@
         <w:tc>
           <w:tcPr>
             <w:tcW w:w="258" w:type="dxa"/>
-            <w:shd w:val="clear" w:color="000000" w:fill="F2F2F2"/>
+            <w:shd w:val="clear" w:color="auto" w:fill="FAFAFA"/>
             <w:noWrap/>
             <w:vAlign w:val="bottom"/>
             <w:hideMark/>
@@ -4413,7 +5164,7 @@
         <w:tc>
           <w:tcPr>
             <w:tcW w:w="258" w:type="dxa"/>
-            <w:shd w:val="clear" w:color="000000" w:fill="F2F2F2"/>
+            <w:shd w:val="clear" w:color="auto" w:fill="FAFAFA"/>
             <w:noWrap/>
             <w:vAlign w:val="bottom"/>
             <w:hideMark/>
@@ -4445,7 +5196,7 @@
         <w:tc>
           <w:tcPr>
             <w:tcW w:w="478" w:type="dxa"/>
-            <w:shd w:val="clear" w:color="000000" w:fill="F2F2F2"/>
+            <w:shd w:val="clear" w:color="auto" w:fill="FAFAFA"/>
             <w:noWrap/>
             <w:vAlign w:val="bottom"/>
             <w:hideMark/>
@@ -4478,7 +5229,7 @@
           <w:tcPr>
             <w:tcW w:w="1655" w:type="dxa"/>
             <w:gridSpan w:val="2"/>
-            <w:shd w:val="clear" w:color="000000" w:fill="F2F2F2"/>
+            <w:shd w:val="clear" w:color="auto" w:fill="FAFAFA"/>
             <w:noWrap/>
             <w:vAlign w:val="bottom"/>
             <w:hideMark/>
@@ -4510,39 +5261,79 @@
         <w:tc>
           <w:tcPr>
             <w:tcW w:w="4140" w:type="dxa"/>
-            <w:shd w:val="clear" w:color="000000" w:fill="F2F2F2"/>
-            <w:noWrap/>
-            <w:vAlign w:val="bottom"/>
-            <w:hideMark/>
-          </w:tcPr>
-          <w:p>
-            <w:pPr>
-              <w:spacing w:after="0" w:line="240" w:lineRule="auto"/>
-              <w:contextualSpacing/>
-              <w:rPr>
-                <w:rFonts w:ascii="Aptos Narrow" w:eastAsia="Times New Roman" w:hAnsi="Aptos Narrow" w:cs="Times New Roman"/>
-                <w:color w:val="000000"/>
-                <w:kern w:val="0"/>
-                <w:lang w:eastAsia="en-GB"/>
-                <w14:ligatures w14:val="none"/>
-              </w:rPr>
-            </w:pPr>
-            <w:r>
-              <w:rPr>
-                <w:rFonts w:ascii="Aptos Narrow" w:eastAsia="Times New Roman" w:hAnsi="Aptos Narrow" w:cs="Times New Roman"/>
-                <w:color w:val="000000"/>
-                <w:kern w:val="0"/>
-                <w:lang w:eastAsia="en-GB"/>
-                <w14:ligatures w14:val="none"/>
-              </w:rPr>
-              <w:t>Use Geo-lookup for timezone location</w:t>
+            <w:shd w:val="clear" w:color="auto" w:fill="FAFAFA"/>
+            <w:noWrap/>
+            <w:vAlign w:val="bottom"/>
+            <w:hideMark/>
+          </w:tcPr>
+          <w:p>
+            <w:pPr>
+              <w:spacing w:after="0" w:line="240" w:lineRule="auto"/>
+              <w:contextualSpacing/>
+              <w:rPr>
+                <w:rFonts w:ascii="Aptos Narrow" w:eastAsia="Times New Roman" w:hAnsi="Aptos Narrow" w:cs="Times New Roman"/>
+                <w:color w:val="000000"/>
+                <w:kern w:val="0"/>
+                <w:lang w:eastAsia="en-GB"/>
+                <w14:ligatures w14:val="none"/>
+              </w:rPr>
+            </w:pPr>
+            <w:r>
+              <w:rPr>
+                <w:rFonts w:ascii="Aptos Narrow" w:eastAsia="Times New Roman" w:hAnsi="Aptos Narrow" w:cs="Times New Roman"/>
+                <w:color w:val="000000"/>
+                <w:kern w:val="0"/>
+                <w:lang w:eastAsia="en-GB"/>
+                <w14:ligatures w14:val="none"/>
+              </w:rPr>
+              <w:t xml:space="preserve">Use </w:t>
+            </w:r>
+            <w:r>
+              <w:rPr>
+                <w:rFonts w:ascii="Aptos Narrow" w:eastAsia="Times New Roman" w:hAnsi="Aptos Narrow" w:cs="Times New Roman"/>
+                <w:color w:val="000000"/>
+                <w:kern w:val="0"/>
+                <w:lang w:eastAsia="en-GB"/>
+                <w14:ligatures w14:val="none"/>
+              </w:rPr>
+              <w:t xml:space="preserve">IP </w:t>
+            </w:r>
+            <w:r>
+              <w:rPr>
+                <w:rFonts w:ascii="Aptos Narrow" w:eastAsia="Times New Roman" w:hAnsi="Aptos Narrow" w:cs="Times New Roman"/>
+                <w:color w:val="000000"/>
+                <w:kern w:val="0"/>
+                <w:lang w:eastAsia="en-GB"/>
+                <w14:ligatures w14:val="none"/>
+              </w:rPr>
+              <w:t xml:space="preserve">lookup for </w:t>
+            </w:r>
+            <w:r>
+              <w:rPr>
+                <w:rFonts w:ascii="Aptos Narrow" w:eastAsia="Times New Roman" w:hAnsi="Aptos Narrow" w:cs="Times New Roman"/>
+                <w:color w:val="000000"/>
+                <w:kern w:val="0"/>
+                <w:lang w:eastAsia="en-GB"/>
+                <w14:ligatures w14:val="none"/>
+              </w:rPr>
+              <w:t xml:space="preserve">auto </w:t>
+            </w:r>
+            <w:r>
+              <w:rPr>
+                <w:rFonts w:ascii="Aptos Narrow" w:eastAsia="Times New Roman" w:hAnsi="Aptos Narrow" w:cs="Times New Roman"/>
+                <w:color w:val="000000"/>
+                <w:kern w:val="0"/>
+                <w:lang w:eastAsia="en-GB"/>
+                <w14:ligatures w14:val="none"/>
+              </w:rPr>
+              <w:t>timezone location</w:t>
             </w:r>
           </w:p>
         </w:tc>
         <w:tc>
           <w:tcPr>
             <w:tcW w:w="258" w:type="dxa"/>
-            <w:shd w:val="clear" w:color="000000" w:fill="F2F2F2"/>
+            <w:shd w:val="clear" w:color="auto" w:fill="FAFAFA"/>
             <w:noWrap/>
             <w:vAlign w:val="bottom"/>
             <w:hideMark/>
@@ -4580,7 +5371,7 @@
         <w:tc>
           <w:tcPr>
             <w:tcW w:w="258" w:type="dxa"/>
-            <w:shd w:val="clear" w:color="000000" w:fill="F2F2F2"/>
+            <w:shd w:val="clear" w:color="auto" w:fill="FAFAFA"/>
             <w:noWrap/>
             <w:vAlign w:val="bottom"/>
             <w:hideMark/>
@@ -4612,7 +5403,7 @@
         <w:tc>
           <w:tcPr>
             <w:tcW w:w="478" w:type="dxa"/>
-            <w:shd w:val="clear" w:color="000000" w:fill="F2F2F2"/>
+            <w:shd w:val="clear" w:color="auto" w:fill="FAFAFA"/>
             <w:noWrap/>
             <w:vAlign w:val="bottom"/>
             <w:hideMark/>
@@ -4645,7 +5436,7 @@
           <w:tcPr>
             <w:tcW w:w="1655" w:type="dxa"/>
             <w:gridSpan w:val="2"/>
-            <w:shd w:val="clear" w:color="000000" w:fill="F2F2F2"/>
+            <w:shd w:val="clear" w:color="auto" w:fill="FAFAFA"/>
             <w:noWrap/>
             <w:vAlign w:val="bottom"/>
             <w:hideMark/>
@@ -4677,39 +5468,79 @@
         <w:tc>
           <w:tcPr>
             <w:tcW w:w="4140" w:type="dxa"/>
-            <w:shd w:val="clear" w:color="000000" w:fill="F2F2F2"/>
-            <w:noWrap/>
-            <w:vAlign w:val="bottom"/>
-            <w:hideMark/>
-          </w:tcPr>
-          <w:p>
-            <w:pPr>
-              <w:spacing w:after="0" w:line="240" w:lineRule="auto"/>
-              <w:contextualSpacing/>
-              <w:rPr>
-                <w:rFonts w:ascii="Aptos Narrow" w:eastAsia="Times New Roman" w:hAnsi="Aptos Narrow" w:cs="Times New Roman"/>
-                <w:color w:val="000000"/>
-                <w:kern w:val="0"/>
-                <w:lang w:eastAsia="en-GB"/>
-                <w14:ligatures w14:val="none"/>
-              </w:rPr>
-            </w:pPr>
-            <w:r>
-              <w:rPr>
-                <w:rFonts w:ascii="Aptos Narrow" w:eastAsia="Times New Roman" w:hAnsi="Aptos Narrow" w:cs="Times New Roman"/>
-                <w:color w:val="000000"/>
-                <w:kern w:val="0"/>
-                <w:lang w:eastAsia="en-GB"/>
-                <w14:ligatures w14:val="none"/>
-              </w:rPr>
-              <w:t>Go to timezone location chooser</w:t>
+            <w:shd w:val="clear" w:color="auto" w:fill="FAFAFA"/>
+            <w:noWrap/>
+            <w:vAlign w:val="bottom"/>
+            <w:hideMark/>
+          </w:tcPr>
+          <w:p>
+            <w:pPr>
+              <w:spacing w:after="0" w:line="240" w:lineRule="auto"/>
+              <w:contextualSpacing/>
+              <w:rPr>
+                <w:rFonts w:ascii="Aptos Narrow" w:eastAsia="Times New Roman" w:hAnsi="Aptos Narrow" w:cs="Times New Roman"/>
+                <w:color w:val="000000"/>
+                <w:kern w:val="0"/>
+                <w:lang w:eastAsia="en-GB"/>
+                <w14:ligatures w14:val="none"/>
+              </w:rPr>
+            </w:pPr>
+            <w:r>
+              <w:rPr>
+                <w:rFonts w:ascii="Aptos Narrow" w:eastAsia="Times New Roman" w:hAnsi="Aptos Narrow" w:cs="Times New Roman"/>
+                <w:color w:val="000000"/>
+                <w:kern w:val="0"/>
+                <w:lang w:eastAsia="en-GB"/>
+                <w14:ligatures w14:val="none"/>
+              </w:rPr>
+              <w:t>C</w:t>
+            </w:r>
+            <w:r>
+              <w:rPr>
+                <w:rFonts w:ascii="Aptos Narrow" w:eastAsia="Times New Roman" w:hAnsi="Aptos Narrow" w:cs="Times New Roman"/>
+                <w:color w:val="000000"/>
+                <w:kern w:val="0"/>
+                <w:lang w:eastAsia="en-GB"/>
+                <w14:ligatures w14:val="none"/>
+              </w:rPr>
+              <w:t xml:space="preserve">hoose </w:t>
+            </w:r>
+            <w:r>
+              <w:rPr>
+                <w:rFonts w:ascii="Aptos Narrow" w:eastAsia="Times New Roman" w:hAnsi="Aptos Narrow" w:cs="Times New Roman"/>
+                <w:color w:val="000000"/>
+                <w:kern w:val="0"/>
+                <w:lang w:eastAsia="en-GB"/>
+                <w14:ligatures w14:val="none"/>
+              </w:rPr>
+              <w:t>t</w:t>
+            </w:r>
+            <w:r>
+              <w:rPr>
+                <w:rFonts w:ascii="Aptos Narrow" w:eastAsia="Times New Roman" w:hAnsi="Aptos Narrow" w:cs="Times New Roman"/>
+                <w:color w:val="000000"/>
+                <w:kern w:val="0"/>
+                <w:lang w:eastAsia="en-GB"/>
+                <w14:ligatures w14:val="none"/>
+              </w:rPr>
+              <w:t>imezone location</w:t>
+            </w:r>
+            <w:r>
+              <w:rPr>
+                <w:rFonts w:ascii="Aptos Narrow" w:eastAsia="Times New Roman" w:hAnsi="Aptos Narrow" w:cs="Times New Roman"/>
+                <w:color w:val="000000"/>
+                <w:kern w:val="0"/>
+                <w:lang w:eastAsia="en-GB"/>
+                <w14:ligatures w14:val="none"/>
+              </w:rPr>
+              <w:t xml:space="preserve"> manually</w:t>
             </w:r>
           </w:p>
         </w:tc>
         <w:tc>
           <w:tcPr>
             <w:tcW w:w="258" w:type="dxa"/>
-            <w:shd w:val="clear" w:color="000000" w:fill="F2F2F2"/>
+            <w:shd w:val="clear" w:color="auto" w:fill="FAFAFA"/>
             <w:noWrap/>
             <w:vAlign w:val="bottom"/>
             <w:hideMark/>
@@ -4747,7 +5578,7 @@
         <w:tc>
           <w:tcPr>
             <w:tcW w:w="258" w:type="dxa"/>
-            <w:shd w:val="clear" w:color="000000" w:fill="F2F2F2"/>
+            <w:shd w:val="clear" w:color="auto" w:fill="FAFAFA"/>
             <w:noWrap/>
             <w:vAlign w:val="bottom"/>
             <w:hideMark/>
@@ -4780,7 +5611,7 @@
           <w:tcPr>
             <w:tcW w:w="893" w:type="dxa"/>
             <w:gridSpan w:val="2"/>
-            <w:shd w:val="clear" w:color="000000" w:fill="F2F2F2"/>
+            <w:shd w:val="clear" w:color="auto" w:fill="FAFAFA"/>
             <w:noWrap/>
             <w:vAlign w:val="bottom"/>
             <w:hideMark/>
@@ -4816,7 +5647,7 @@
         <w:tc>
           <w:tcPr>
             <w:tcW w:w="1240" w:type="dxa"/>
-            <w:shd w:val="clear" w:color="000000" w:fill="F2F2F2"/>
+            <w:shd w:val="clear" w:color="auto" w:fill="FAFAFA"/>
             <w:noWrap/>
             <w:vAlign w:val="bottom"/>
             <w:hideMark/>
@@ -4848,7 +5679,7 @@
         <w:tc>
           <w:tcPr>
             <w:tcW w:w="4140" w:type="dxa"/>
-            <w:shd w:val="clear" w:color="000000" w:fill="F2F2F2"/>
+            <w:shd w:val="clear" w:color="auto" w:fill="FAFAFA"/>
             <w:noWrap/>
             <w:vAlign w:val="bottom"/>
             <w:hideMark/>
@@ -4880,7 +5711,7 @@
         <w:tc>
           <w:tcPr>
             <w:tcW w:w="258" w:type="dxa"/>
-            <w:shd w:val="clear" w:color="000000" w:fill="F2F2F2"/>
+            <w:shd w:val="clear" w:color="auto" w:fill="FAFAFA"/>
             <w:noWrap/>
             <w:vAlign w:val="bottom"/>
             <w:hideMark/>
@@ -4918,7 +5749,7 @@
         <w:tc>
           <w:tcPr>
             <w:tcW w:w="258" w:type="dxa"/>
-            <w:shd w:val="clear" w:color="000000" w:fill="F2F2F2"/>
+            <w:shd w:val="clear" w:color="auto" w:fill="FAFAFA"/>
             <w:noWrap/>
             <w:vAlign w:val="bottom"/>
             <w:hideMark/>
@@ -4950,7 +5781,7 @@
         <w:tc>
           <w:tcPr>
             <w:tcW w:w="478" w:type="dxa"/>
-            <w:shd w:val="clear" w:color="000000" w:fill="F2F2F2"/>
+            <w:shd w:val="clear" w:color="auto" w:fill="FAFAFA"/>
             <w:noWrap/>
             <w:vAlign w:val="bottom"/>
             <w:hideMark/>
@@ -4983,7 +5814,7 @@
           <w:tcPr>
             <w:tcW w:w="1655" w:type="dxa"/>
             <w:gridSpan w:val="2"/>
-            <w:shd w:val="clear" w:color="000000" w:fill="F2F2F2"/>
+            <w:shd w:val="clear" w:color="auto" w:fill="FAFAFA"/>
             <w:noWrap/>
             <w:vAlign w:val="bottom"/>
             <w:hideMark/>
@@ -5015,7 +5846,7 @@
         <w:tc>
           <w:tcPr>
             <w:tcW w:w="4140" w:type="dxa"/>
-            <w:shd w:val="clear" w:color="000000" w:fill="F2F2F2"/>
+            <w:shd w:val="clear" w:color="auto" w:fill="FAFAFA"/>
             <w:noWrap/>
             <w:vAlign w:val="bottom"/>
             <w:hideMark/>
@@ -5047,7 +5878,7 @@
         <w:tc>
           <w:tcPr>
             <w:tcW w:w="258" w:type="dxa"/>
-            <w:shd w:val="clear" w:color="000000" w:fill="F2F2F2"/>
+            <w:shd w:val="clear" w:color="auto" w:fill="FAFAFA"/>
             <w:noWrap/>
             <w:vAlign w:val="bottom"/>
             <w:hideMark/>
@@ -5085,7 +5916,7 @@
         <w:tc>
           <w:tcPr>
             <w:tcW w:w="258" w:type="dxa"/>
-            <w:shd w:val="clear" w:color="000000" w:fill="F2F2F2"/>
+            <w:shd w:val="clear" w:color="auto" w:fill="FAFAFA"/>
             <w:noWrap/>
             <w:vAlign w:val="bottom"/>
             <w:hideMark/>
@@ -5117,7 +5948,7 @@
         <w:tc>
           <w:tcPr>
             <w:tcW w:w="478" w:type="dxa"/>
-            <w:shd w:val="clear" w:color="000000" w:fill="F2F2F2"/>
+            <w:shd w:val="clear" w:color="auto" w:fill="FAFAFA"/>
             <w:noWrap/>
             <w:vAlign w:val="bottom"/>
             <w:hideMark/>
@@ -5150,7 +5981,7 @@
           <w:tcPr>
             <w:tcW w:w="1655" w:type="dxa"/>
             <w:gridSpan w:val="2"/>
-            <w:shd w:val="clear" w:color="000000" w:fill="F2F2F2"/>
+            <w:shd w:val="clear" w:color="auto" w:fill="FAFAFA"/>
             <w:noWrap/>
             <w:vAlign w:val="bottom"/>
             <w:hideMark/>
@@ -5182,7 +6013,7 @@
         <w:tc>
           <w:tcPr>
             <w:tcW w:w="4140" w:type="dxa"/>
-            <w:shd w:val="clear" w:color="000000" w:fill="F2F2F2"/>
+            <w:shd w:val="clear" w:color="auto" w:fill="FAFAFA"/>
             <w:noWrap/>
             <w:vAlign w:val="bottom"/>
             <w:hideMark/>
@@ -5214,7 +6045,7 @@
         <w:tc>
           <w:tcPr>
             <w:tcW w:w="258" w:type="dxa"/>
-            <w:shd w:val="clear" w:color="000000" w:fill="F2F2F2"/>
+            <w:shd w:val="clear" w:color="auto" w:fill="FAFAFA"/>
             <w:noWrap/>
             <w:vAlign w:val="bottom"/>
             <w:hideMark/>
@@ -5252,7 +6083,7 @@
         <w:tc>
           <w:tcPr>
             <w:tcW w:w="258" w:type="dxa"/>
-            <w:shd w:val="clear" w:color="000000" w:fill="F2F2F2"/>
+            <w:shd w:val="clear" w:color="auto" w:fill="FAFAFA"/>
             <w:noWrap/>
             <w:vAlign w:val="bottom"/>
             <w:hideMark/>
@@ -5284,7 +6115,7 @@
         <w:tc>
           <w:tcPr>
             <w:tcW w:w="478" w:type="dxa"/>
-            <w:shd w:val="clear" w:color="000000" w:fill="F2F2F2"/>
+            <w:shd w:val="clear" w:color="auto" w:fill="FAFAFA"/>
             <w:noWrap/>
             <w:vAlign w:val="bottom"/>
             <w:hideMark/>
@@ -5317,7 +6148,7 @@
           <w:tcPr>
             <w:tcW w:w="1655" w:type="dxa"/>
             <w:gridSpan w:val="2"/>
-            <w:shd w:val="clear" w:color="000000" w:fill="F2F2F2"/>
+            <w:shd w:val="clear" w:color="auto" w:fill="FAFAFA"/>
             <w:noWrap/>
             <w:hideMark/>
           </w:tcPr>
@@ -5348,7 +6179,7 @@
         <w:tc>
           <w:tcPr>
             <w:tcW w:w="4140" w:type="dxa"/>
-            <w:shd w:val="clear" w:color="000000" w:fill="F2F2F2"/>
+            <w:shd w:val="clear" w:color="auto" w:fill="FAFAFA"/>
             <w:noWrap/>
             <w:vAlign w:val="bottom"/>
             <w:hideMark/>
@@ -5406,7 +6237,7 @@
         <w:tc>
           <w:tcPr>
             <w:tcW w:w="258" w:type="dxa"/>
-            <w:shd w:val="clear" w:color="000000" w:fill="F2F2F2"/>
+            <w:shd w:val="clear" w:color="auto" w:fill="FAFAFA"/>
             <w:noWrap/>
             <w:vAlign w:val="bottom"/>
             <w:hideMark/>
@@ -5449,12 +6280,588 @@
     </w:p>
     <w:sectPr>
       <w:pgSz w:w="8419" w:h="11906" w:orient="landscape" w:code="9"/>
-      <w:pgMar w:top="709" w:right="339" w:bottom="851" w:left="851" w:header="709" w:footer="709" w:gutter="567"/>
+      <w:pgMar w:top="709" w:right="339" w:bottom="567" w:left="851" w:header="709" w:footer="709" w:gutter="567"/>
       <w:cols w:space="708"/>
       <w:docGrid w:linePitch="360"/>
     </w:sectPr>
   </w:body>
 </w:document>
+</file>
+
+<file path=word/numbering.xml><?xml version="1.0" encoding="utf-8"?>
+<w:numbering xmlns:wpc="http://schemas.microsoft.com/office/word/2010/wordprocessingCanvas" xmlns:cx="http://schemas.microsoft.com/office/drawing/2014/chartex" xmlns:cx1="http://schemas.microsoft.com/office/drawing/2015/9/8/chartex" xmlns:cx2="http://schemas.microsoft.com/office/drawing/2015/10/21/chartex" xmlns:cx3="http://schemas.microsoft.com/office/drawing/2016/5/9/chartex" xmlns:cx4="http://schemas.microsoft.com/office/drawing/2016/5/10/chartex" xmlns:cx5="http://schemas.microsoft.com/office/drawing/2016/5/11/chartex" xmlns:cx6="http://schemas.microsoft.com/office/drawing/2016/5/12/chartex" xmlns:cx7="http://schemas.microsoft.com/office/drawing/2016/5/13/chartex" xmlns:cx8="http://schemas.microsoft.com/office/drawing/2016/5/14/chartex" xmlns:mc="http://schemas.openxmlformats.org/markup-compatibility/2006" xmlns:aink="http://schemas.microsoft.com/office/drawing/2016/ink" xmlns:am3d="http://schemas.microsoft.com/office/drawing/2017/model3d" xmlns:o="urn:schemas-microsoft-com:office:office" xmlns:oel="http://schemas.microsoft.com/office/2019/extlst" xmlns:r="http://schemas.openxmlformats.org/officeDocument/2006/relationships" xmlns:m="http://schemas.openxmlformats.org/officeDocument/2006/math" xmlns:v="urn:schemas-microsoft-com:vml" xmlns:wp14="http://schemas.microsoft.com/office/word/2010/wordprocessingDrawing" xmlns:wp="http://schemas.openxmlformats.org/drawingml/2006/wordprocessingDrawing" xmlns:w10="urn:schemas-microsoft-com:office:word" xmlns:w="http://schemas.openxmlformats.org/wordprocessingml/2006/main" xmlns:w14="http://schemas.microsoft.com/office/word/2010/wordml" xmlns:w15="http://schemas.microsoft.com/office/word/2012/wordml" xmlns:w16cex="http://schemas.microsoft.com/office/word/2018/wordml/cex" xmlns:w16cid="http://schemas.microsoft.com/office/word/2016/wordml/cid" xmlns:w16="http://schemas.microsoft.com/office/word/2018/wordml" xmlns:w16du="http://schemas.microsoft.com/office/word/2023/wordml/word16du" xmlns:w16sdtdh="http://schemas.microsoft.com/office/word/2020/wordml/sdtdatahash" xmlns:w16sdtfl="http://schemas.microsoft.com/office/word/2024/wordml/sdtformatlock" xmlns:w16se="http://schemas.microsoft.com/office/word/2015/wordml/symex" xmlns:wpg="http://schemas.microsoft.com/office/word/2010/wordprocessingGroup" xmlns:wpi="http://schemas.microsoft.com/office/word/2010/wordprocessingInk" xmlns:wne="http://schemas.microsoft.com/office/word/2006/wordml" xmlns:wps="http://schemas.microsoft.com/office/word/2010/wordprocessingShape" mc:Ignorable="w14 w15 w16se w16cid w16 w16cex w16sdtdh w16sdtfl w16du wp14">
+  <w:abstractNum w:abstractNumId="0" w15:restartNumberingAfterBreak="0">
+    <w:nsid w:val="05344A99"/>
+    <w:multiLevelType w:val="multilevel"/>
+    <w:tmpl w:val="A43C0AE4"/>
+    <w:lvl w:ilvl="0">
+      <w:start w:val="1"/>
+      <w:numFmt w:val="bullet"/>
+      <w:lvlText w:val=""/>
+      <w:lvlJc w:val="left"/>
+      <w:pPr>
+        <w:tabs>
+          <w:tab w:val="num" w:pos="397"/>
+        </w:tabs>
+        <w:ind w:left="284" w:hanging="227"/>
+      </w:pPr>
+      <w:rPr>
+        <w:rFonts w:ascii="Symbol" w:hAnsi="Symbol" w:hint="default"/>
+        <w:sz w:val="20"/>
+      </w:rPr>
+    </w:lvl>
+    <w:lvl w:ilvl="1">
+      <w:start w:val="1"/>
+      <w:numFmt w:val="bullet"/>
+      <w:lvlText w:val="o"/>
+      <w:lvlJc w:val="left"/>
+      <w:pPr>
+        <w:tabs>
+          <w:tab w:val="num" w:pos="1440"/>
+        </w:tabs>
+        <w:ind w:left="1440" w:hanging="360"/>
+      </w:pPr>
+      <w:rPr>
+        <w:rFonts w:ascii="Courier New" w:hAnsi="Courier New" w:hint="default"/>
+        <w:sz w:val="20"/>
+      </w:rPr>
+    </w:lvl>
+    <w:lvl w:ilvl="2">
+      <w:start w:val="1"/>
+      <w:numFmt w:val="bullet"/>
+      <w:lvlText w:val=""/>
+      <w:lvlJc w:val="left"/>
+      <w:pPr>
+        <w:tabs>
+          <w:tab w:val="num" w:pos="2160"/>
+        </w:tabs>
+        <w:ind w:left="2160" w:hanging="360"/>
+      </w:pPr>
+      <w:rPr>
+        <w:rFonts w:ascii="Wingdings" w:hAnsi="Wingdings" w:hint="default"/>
+        <w:sz w:val="20"/>
+      </w:rPr>
+    </w:lvl>
+    <w:lvl w:ilvl="3">
+      <w:start w:val="1"/>
+      <w:numFmt w:val="bullet"/>
+      <w:lvlText w:val=""/>
+      <w:lvlJc w:val="left"/>
+      <w:pPr>
+        <w:tabs>
+          <w:tab w:val="num" w:pos="2880"/>
+        </w:tabs>
+        <w:ind w:left="2880" w:hanging="360"/>
+      </w:pPr>
+      <w:rPr>
+        <w:rFonts w:ascii="Wingdings" w:hAnsi="Wingdings" w:hint="default"/>
+        <w:sz w:val="20"/>
+      </w:rPr>
+    </w:lvl>
+    <w:lvl w:ilvl="4">
+      <w:start w:val="1"/>
+      <w:numFmt w:val="bullet"/>
+      <w:lvlText w:val=""/>
+      <w:lvlJc w:val="left"/>
+      <w:pPr>
+        <w:tabs>
+          <w:tab w:val="num" w:pos="3600"/>
+        </w:tabs>
+        <w:ind w:left="3600" w:hanging="360"/>
+      </w:pPr>
+      <w:rPr>
+        <w:rFonts w:ascii="Wingdings" w:hAnsi="Wingdings" w:hint="default"/>
+        <w:sz w:val="20"/>
+      </w:rPr>
+    </w:lvl>
+    <w:lvl w:ilvl="5">
+      <w:start w:val="1"/>
+      <w:numFmt w:val="bullet"/>
+      <w:lvlText w:val=""/>
+      <w:lvlJc w:val="left"/>
+      <w:pPr>
+        <w:tabs>
+          <w:tab w:val="num" w:pos="4320"/>
+        </w:tabs>
+        <w:ind w:left="4320" w:hanging="360"/>
+      </w:pPr>
+      <w:rPr>
+        <w:rFonts w:ascii="Wingdings" w:hAnsi="Wingdings" w:hint="default"/>
+        <w:sz w:val="20"/>
+      </w:rPr>
+    </w:lvl>
+    <w:lvl w:ilvl="6">
+      <w:start w:val="1"/>
+      <w:numFmt w:val="bullet"/>
+      <w:lvlText w:val=""/>
+      <w:lvlJc w:val="left"/>
+      <w:pPr>
+        <w:tabs>
+          <w:tab w:val="num" w:pos="5040"/>
+        </w:tabs>
+        <w:ind w:left="5040" w:hanging="360"/>
+      </w:pPr>
+      <w:rPr>
+        <w:rFonts w:ascii="Wingdings" w:hAnsi="Wingdings" w:hint="default"/>
+        <w:sz w:val="20"/>
+      </w:rPr>
+    </w:lvl>
+    <w:lvl w:ilvl="7">
+      <w:start w:val="1"/>
+      <w:numFmt w:val="bullet"/>
+      <w:lvlText w:val=""/>
+      <w:lvlJc w:val="left"/>
+      <w:pPr>
+        <w:tabs>
+          <w:tab w:val="num" w:pos="5760"/>
+        </w:tabs>
+        <w:ind w:left="5760" w:hanging="360"/>
+      </w:pPr>
+      <w:rPr>
+        <w:rFonts w:ascii="Wingdings" w:hAnsi="Wingdings" w:hint="default"/>
+        <w:sz w:val="20"/>
+      </w:rPr>
+    </w:lvl>
+    <w:lvl w:ilvl="8">
+      <w:start w:val="1"/>
+      <w:numFmt w:val="bullet"/>
+      <w:lvlText w:val=""/>
+      <w:lvlJc w:val="left"/>
+      <w:pPr>
+        <w:tabs>
+          <w:tab w:val="num" w:pos="6480"/>
+        </w:tabs>
+        <w:ind w:left="6480" w:hanging="360"/>
+      </w:pPr>
+      <w:rPr>
+        <w:rFonts w:ascii="Wingdings" w:hAnsi="Wingdings" w:hint="default"/>
+        <w:sz w:val="20"/>
+      </w:rPr>
+    </w:lvl>
+  </w:abstractNum>
+  <w:abstractNum w:abstractNumId="1" w15:restartNumberingAfterBreak="0">
+    <w:nsid w:val="0F9F05B1"/>
+    <w:multiLevelType w:val="hybridMultilevel"/>
+    <w:tmpl w:val="4770088A"/>
+    <w:lvl w:ilvl="0" w:tplc="4FC240BE">
+      <w:numFmt w:val="bullet"/>
+      <w:lvlText w:val=""/>
+      <w:lvlJc w:val="left"/>
+      <w:pPr>
+        <w:ind w:left="720" w:hanging="360"/>
+      </w:pPr>
+      <w:rPr>
+        <w:rFonts w:ascii="Symbol" w:eastAsiaTheme="minorHAnsi" w:hAnsi="Symbol" w:cstheme="minorBidi" w:hint="default"/>
+      </w:rPr>
+    </w:lvl>
+    <w:lvl w:ilvl="1" w:tplc="08090003" w:tentative="1">
+      <w:start w:val="1"/>
+      <w:numFmt w:val="bullet"/>
+      <w:lvlText w:val="o"/>
+      <w:lvlJc w:val="left"/>
+      <w:pPr>
+        <w:ind w:left="1440" w:hanging="360"/>
+      </w:pPr>
+      <w:rPr>
+        <w:rFonts w:ascii="Courier New" w:hAnsi="Courier New" w:cs="Courier New" w:hint="default"/>
+      </w:rPr>
+    </w:lvl>
+    <w:lvl w:ilvl="2" w:tplc="08090005" w:tentative="1">
+      <w:start w:val="1"/>
+      <w:numFmt w:val="bullet"/>
+      <w:lvlText w:val=""/>
+      <w:lvlJc w:val="left"/>
+      <w:pPr>
+        <w:ind w:left="2160" w:hanging="360"/>
+      </w:pPr>
+      <w:rPr>
+        <w:rFonts w:ascii="Wingdings" w:hAnsi="Wingdings" w:hint="default"/>
+      </w:rPr>
+    </w:lvl>
+    <w:lvl w:ilvl="3" w:tplc="08090001" w:tentative="1">
+      <w:start w:val="1"/>
+      <w:numFmt w:val="bullet"/>
+      <w:lvlText w:val=""/>
+      <w:lvlJc w:val="left"/>
+      <w:pPr>
+        <w:ind w:left="2880" w:hanging="360"/>
+      </w:pPr>
+      <w:rPr>
+        <w:rFonts w:ascii="Symbol" w:hAnsi="Symbol" w:hint="default"/>
+      </w:rPr>
+    </w:lvl>
+    <w:lvl w:ilvl="4" w:tplc="08090003" w:tentative="1">
+      <w:start w:val="1"/>
+      <w:numFmt w:val="bullet"/>
+      <w:lvlText w:val="o"/>
+      <w:lvlJc w:val="left"/>
+      <w:pPr>
+        <w:ind w:left="3600" w:hanging="360"/>
+      </w:pPr>
+      <w:rPr>
+        <w:rFonts w:ascii="Courier New" w:hAnsi="Courier New" w:cs="Courier New" w:hint="default"/>
+      </w:rPr>
+    </w:lvl>
+    <w:lvl w:ilvl="5" w:tplc="08090005" w:tentative="1">
+      <w:start w:val="1"/>
+      <w:numFmt w:val="bullet"/>
+      <w:lvlText w:val=""/>
+      <w:lvlJc w:val="left"/>
+      <w:pPr>
+        <w:ind w:left="4320" w:hanging="360"/>
+      </w:pPr>
+      <w:rPr>
+        <w:rFonts w:ascii="Wingdings" w:hAnsi="Wingdings" w:hint="default"/>
+      </w:rPr>
+    </w:lvl>
+    <w:lvl w:ilvl="6" w:tplc="08090001" w:tentative="1">
+      <w:start w:val="1"/>
+      <w:numFmt w:val="bullet"/>
+      <w:lvlText w:val=""/>
+      <w:lvlJc w:val="left"/>
+      <w:pPr>
+        <w:ind w:left="5040" w:hanging="360"/>
+      </w:pPr>
+      <w:rPr>
+        <w:rFonts w:ascii="Symbol" w:hAnsi="Symbol" w:hint="default"/>
+      </w:rPr>
+    </w:lvl>
+    <w:lvl w:ilvl="7" w:tplc="08090003" w:tentative="1">
+      <w:start w:val="1"/>
+      <w:numFmt w:val="bullet"/>
+      <w:lvlText w:val="o"/>
+      <w:lvlJc w:val="left"/>
+      <w:pPr>
+        <w:ind w:left="5760" w:hanging="360"/>
+      </w:pPr>
+      <w:rPr>
+        <w:rFonts w:ascii="Courier New" w:hAnsi="Courier New" w:cs="Courier New" w:hint="default"/>
+      </w:rPr>
+    </w:lvl>
+    <w:lvl w:ilvl="8" w:tplc="08090005" w:tentative="1">
+      <w:start w:val="1"/>
+      <w:numFmt w:val="bullet"/>
+      <w:lvlText w:val=""/>
+      <w:lvlJc w:val="left"/>
+      <w:pPr>
+        <w:ind w:left="6480" w:hanging="360"/>
+      </w:pPr>
+      <w:rPr>
+        <w:rFonts w:ascii="Wingdings" w:hAnsi="Wingdings" w:hint="default"/>
+      </w:rPr>
+    </w:lvl>
+  </w:abstractNum>
+  <w:abstractNum w:abstractNumId="2" w15:restartNumberingAfterBreak="0">
+    <w:nsid w:val="35AE0414"/>
+    <w:multiLevelType w:val="multilevel"/>
+    <w:tmpl w:val="559CB176"/>
+    <w:lvl w:ilvl="0">
+      <w:start w:val="1"/>
+      <w:numFmt w:val="bullet"/>
+      <w:lvlText w:val=""/>
+      <w:lvlJc w:val="left"/>
+      <w:pPr>
+        <w:tabs>
+          <w:tab w:val="num" w:pos="720"/>
+        </w:tabs>
+        <w:ind w:left="720" w:hanging="360"/>
+      </w:pPr>
+      <w:rPr>
+        <w:rFonts w:ascii="Symbol" w:hAnsi="Symbol" w:hint="default"/>
+        <w:sz w:val="20"/>
+      </w:rPr>
+    </w:lvl>
+    <w:lvl w:ilvl="1" w:tentative="1">
+      <w:start w:val="1"/>
+      <w:numFmt w:val="bullet"/>
+      <w:lvlText w:val="o"/>
+      <w:lvlJc w:val="left"/>
+      <w:pPr>
+        <w:tabs>
+          <w:tab w:val="num" w:pos="1440"/>
+        </w:tabs>
+        <w:ind w:left="1440" w:hanging="360"/>
+      </w:pPr>
+      <w:rPr>
+        <w:rFonts w:ascii="Courier New" w:hAnsi="Courier New" w:hint="default"/>
+        <w:sz w:val="20"/>
+      </w:rPr>
+    </w:lvl>
+    <w:lvl w:ilvl="2" w:tentative="1">
+      <w:start w:val="1"/>
+      <w:numFmt w:val="bullet"/>
+      <w:lvlText w:val=""/>
+      <w:lvlJc w:val="left"/>
+      <w:pPr>
+        <w:tabs>
+          <w:tab w:val="num" w:pos="2160"/>
+        </w:tabs>
+        <w:ind w:left="2160" w:hanging="360"/>
+      </w:pPr>
+      <w:rPr>
+        <w:rFonts w:ascii="Wingdings" w:hAnsi="Wingdings" w:hint="default"/>
+        <w:sz w:val="20"/>
+      </w:rPr>
+    </w:lvl>
+    <w:lvl w:ilvl="3" w:tentative="1">
+      <w:start w:val="1"/>
+      <w:numFmt w:val="bullet"/>
+      <w:lvlText w:val=""/>
+      <w:lvlJc w:val="left"/>
+      <w:pPr>
+        <w:tabs>
+          <w:tab w:val="num" w:pos="2880"/>
+        </w:tabs>
+        <w:ind w:left="2880" w:hanging="360"/>
+      </w:pPr>
+      <w:rPr>
+        <w:rFonts w:ascii="Wingdings" w:hAnsi="Wingdings" w:hint="default"/>
+        <w:sz w:val="20"/>
+      </w:rPr>
+    </w:lvl>
+    <w:lvl w:ilvl="4" w:tentative="1">
+      <w:start w:val="1"/>
+      <w:numFmt w:val="bullet"/>
+      <w:lvlText w:val=""/>
+      <w:lvlJc w:val="left"/>
+      <w:pPr>
+        <w:tabs>
+          <w:tab w:val="num" w:pos="3600"/>
+        </w:tabs>
+        <w:ind w:left="3600" w:hanging="360"/>
+      </w:pPr>
+      <w:rPr>
+        <w:rFonts w:ascii="Wingdings" w:hAnsi="Wingdings" w:hint="default"/>
+        <w:sz w:val="20"/>
+      </w:rPr>
+    </w:lvl>
+    <w:lvl w:ilvl="5" w:tentative="1">
+      <w:start w:val="1"/>
+      <w:numFmt w:val="bullet"/>
+      <w:lvlText w:val=""/>
+      <w:lvlJc w:val="left"/>
+      <w:pPr>
+        <w:tabs>
+          <w:tab w:val="num" w:pos="4320"/>
+        </w:tabs>
+        <w:ind w:left="4320" w:hanging="360"/>
+      </w:pPr>
+      <w:rPr>
+        <w:rFonts w:ascii="Wingdings" w:hAnsi="Wingdings" w:hint="default"/>
+        <w:sz w:val="20"/>
+      </w:rPr>
+    </w:lvl>
+    <w:lvl w:ilvl="6" w:tentative="1">
+      <w:start w:val="1"/>
+      <w:numFmt w:val="bullet"/>
+      <w:lvlText w:val=""/>
+      <w:lvlJc w:val="left"/>
+      <w:pPr>
+        <w:tabs>
+          <w:tab w:val="num" w:pos="5040"/>
+        </w:tabs>
+        <w:ind w:left="5040" w:hanging="360"/>
+      </w:pPr>
+      <w:rPr>
+        <w:rFonts w:ascii="Wingdings" w:hAnsi="Wingdings" w:hint="default"/>
+        <w:sz w:val="20"/>
+      </w:rPr>
+    </w:lvl>
+    <w:lvl w:ilvl="7" w:tentative="1">
+      <w:start w:val="1"/>
+      <w:numFmt w:val="bullet"/>
+      <w:lvlText w:val=""/>
+      <w:lvlJc w:val="left"/>
+      <w:pPr>
+        <w:tabs>
+          <w:tab w:val="num" w:pos="5760"/>
+        </w:tabs>
+        <w:ind w:left="5760" w:hanging="360"/>
+      </w:pPr>
+      <w:rPr>
+        <w:rFonts w:ascii="Wingdings" w:hAnsi="Wingdings" w:hint="default"/>
+        <w:sz w:val="20"/>
+      </w:rPr>
+    </w:lvl>
+    <w:lvl w:ilvl="8" w:tentative="1">
+      <w:start w:val="1"/>
+      <w:numFmt w:val="bullet"/>
+      <w:lvlText w:val=""/>
+      <w:lvlJc w:val="left"/>
+      <w:pPr>
+        <w:tabs>
+          <w:tab w:val="num" w:pos="6480"/>
+        </w:tabs>
+        <w:ind w:left="6480" w:hanging="360"/>
+      </w:pPr>
+      <w:rPr>
+        <w:rFonts w:ascii="Wingdings" w:hAnsi="Wingdings" w:hint="default"/>
+        <w:sz w:val="20"/>
+      </w:rPr>
+    </w:lvl>
+  </w:abstractNum>
+  <w:abstractNum w:abstractNumId="3" w15:restartNumberingAfterBreak="0">
+    <w:nsid w:val="52F67EBC"/>
+    <w:multiLevelType w:val="multilevel"/>
+    <w:tmpl w:val="8FD6A504"/>
+    <w:lvl w:ilvl="0">
+      <w:start w:val="1"/>
+      <w:numFmt w:val="bullet"/>
+      <w:lvlText w:val=""/>
+      <w:lvlJc w:val="left"/>
+      <w:pPr>
+        <w:tabs>
+          <w:tab w:val="num" w:pos="720"/>
+        </w:tabs>
+        <w:ind w:left="720" w:hanging="360"/>
+      </w:pPr>
+      <w:rPr>
+        <w:rFonts w:ascii="Symbol" w:hAnsi="Symbol" w:hint="default"/>
+        <w:sz w:val="20"/>
+      </w:rPr>
+    </w:lvl>
+    <w:lvl w:ilvl="1" w:tentative="1">
+      <w:start w:val="1"/>
+      <w:numFmt w:val="bullet"/>
+      <w:lvlText w:val="o"/>
+      <w:lvlJc w:val="left"/>
+      <w:pPr>
+        <w:tabs>
+          <w:tab w:val="num" w:pos="1440"/>
+        </w:tabs>
+        <w:ind w:left="1440" w:hanging="360"/>
+      </w:pPr>
+      <w:rPr>
+        <w:rFonts w:ascii="Courier New" w:hAnsi="Courier New" w:hint="default"/>
+        <w:sz w:val="20"/>
+      </w:rPr>
+    </w:lvl>
+    <w:lvl w:ilvl="2" w:tentative="1">
+      <w:start w:val="1"/>
+      <w:numFmt w:val="bullet"/>
+      <w:lvlText w:val=""/>
+      <w:lvlJc w:val="left"/>
+      <w:pPr>
+        <w:tabs>
+          <w:tab w:val="num" w:pos="2160"/>
+        </w:tabs>
+        <w:ind w:left="2160" w:hanging="360"/>
+      </w:pPr>
+      <w:rPr>
+        <w:rFonts w:ascii="Wingdings" w:hAnsi="Wingdings" w:hint="default"/>
+        <w:sz w:val="20"/>
+      </w:rPr>
+    </w:lvl>
+    <w:lvl w:ilvl="3" w:tentative="1">
+      <w:start w:val="1"/>
+      <w:numFmt w:val="bullet"/>
+      <w:lvlText w:val=""/>
+      <w:lvlJc w:val="left"/>
+      <w:pPr>
+        <w:tabs>
+          <w:tab w:val="num" w:pos="2880"/>
+        </w:tabs>
+        <w:ind w:left="2880" w:hanging="360"/>
+      </w:pPr>
+      <w:rPr>
+        <w:rFonts w:ascii="Wingdings" w:hAnsi="Wingdings" w:hint="default"/>
+        <w:sz w:val="20"/>
+      </w:rPr>
+    </w:lvl>
+    <w:lvl w:ilvl="4" w:tentative="1">
+      <w:start w:val="1"/>
+      <w:numFmt w:val="bullet"/>
+      <w:lvlText w:val=""/>
+      <w:lvlJc w:val="left"/>
+      <w:pPr>
+        <w:tabs>
+          <w:tab w:val="num" w:pos="3600"/>
+        </w:tabs>
+        <w:ind w:left="3600" w:hanging="360"/>
+      </w:pPr>
+      <w:rPr>
+        <w:rFonts w:ascii="Wingdings" w:hAnsi="Wingdings" w:hint="default"/>
+        <w:sz w:val="20"/>
+      </w:rPr>
+    </w:lvl>
+    <w:lvl w:ilvl="5" w:tentative="1">
+      <w:start w:val="1"/>
+      <w:numFmt w:val="bullet"/>
+      <w:lvlText w:val=""/>
+      <w:lvlJc w:val="left"/>
+      <w:pPr>
+        <w:tabs>
+          <w:tab w:val="num" w:pos="4320"/>
+        </w:tabs>
+        <w:ind w:left="4320" w:hanging="360"/>
+      </w:pPr>
+      <w:rPr>
+        <w:rFonts w:ascii="Wingdings" w:hAnsi="Wingdings" w:hint="default"/>
+        <w:sz w:val="20"/>
+      </w:rPr>
+    </w:lvl>
+    <w:lvl w:ilvl="6" w:tentative="1">
+      <w:start w:val="1"/>
+      <w:numFmt w:val="bullet"/>
+      <w:lvlText w:val=""/>
+      <w:lvlJc w:val="left"/>
+      <w:pPr>
+        <w:tabs>
+          <w:tab w:val="num" w:pos="5040"/>
+        </w:tabs>
+        <w:ind w:left="5040" w:hanging="360"/>
+      </w:pPr>
+      <w:rPr>
+        <w:rFonts w:ascii="Wingdings" w:hAnsi="Wingdings" w:hint="default"/>
+        <w:sz w:val="20"/>
+      </w:rPr>
+    </w:lvl>
+    <w:lvl w:ilvl="7" w:tentative="1">
+      <w:start w:val="1"/>
+      <w:numFmt w:val="bullet"/>
+      <w:lvlText w:val=""/>
+      <w:lvlJc w:val="left"/>
+      <w:pPr>
+        <w:tabs>
+          <w:tab w:val="num" w:pos="5760"/>
+        </w:tabs>
+        <w:ind w:left="5760" w:hanging="360"/>
+      </w:pPr>
+      <w:rPr>
+        <w:rFonts w:ascii="Wingdings" w:hAnsi="Wingdings" w:hint="default"/>
+        <w:sz w:val="20"/>
+      </w:rPr>
+    </w:lvl>
+    <w:lvl w:ilvl="8" w:tentative="1">
+      <w:start w:val="1"/>
+      <w:numFmt w:val="bullet"/>
+      <w:lvlText w:val=""/>
+      <w:lvlJc w:val="left"/>
+      <w:pPr>
+        <w:tabs>
+          <w:tab w:val="num" w:pos="6480"/>
+        </w:tabs>
+        <w:ind w:left="6480" w:hanging="360"/>
+      </w:pPr>
+      <w:rPr>
+        <w:rFonts w:ascii="Wingdings" w:hAnsi="Wingdings" w:hint="default"/>
+        <w:sz w:val="20"/>
+      </w:rPr>
+    </w:lvl>
+  </w:abstractNum>
+  <w:num w:numId="1" w16cid:durableId="1369112596">
+    <w:abstractNumId w:val="1"/>
+  </w:num>
+  <w:num w:numId="2" w16cid:durableId="60445642">
+    <w:abstractNumId w:val="0"/>
+  </w:num>
+  <w:num w:numId="3" w16cid:durableId="1388455940">
+    <w:abstractNumId w:val="2"/>
+  </w:num>
+  <w:num w:numId="4" w16cid:durableId="2114812419">
+    <w:abstractNumId w:val="3"/>
+  </w:num>
+</w:numbering>
 </file>
 
 <file path=word/styles.xml><?xml version="1.0" encoding="utf-8"?>
@@ -5857,15 +7264,17 @@
   <w:style w:type="paragraph" w:default="1" w:styleId="Normal">
     <w:name w:val="Normal"/>
     <w:qFormat/>
+    <w:rsid w:val="00EF2D38"/>
   </w:style>
   <w:style w:type="paragraph" w:styleId="Heading1">
     <w:name w:val="heading 1"/>
     <w:basedOn w:val="Normal"/>
     <w:next w:val="Normal"/>
     <w:link w:val="Heading1Char"/>
+    <w:autoRedefine/>
     <w:uiPriority w:val="9"/>
     <w:qFormat/>
-    <w:rsid w:val="00301741"/>
+    <w:rsid w:val="001F3926"/>
     <w:pPr>
       <w:keepNext/>
       <w:keepLines/>
@@ -5874,7 +7283,7 @@
     </w:pPr>
     <w:rPr>
       <w:rFonts w:asciiTheme="majorHAnsi" w:eastAsiaTheme="majorEastAsia" w:hAnsiTheme="majorHAnsi" w:cstheme="majorBidi"/>
-      <w:color w:val="0F4761" w:themeColor="accent1" w:themeShade="BF"/>
+      <w:b/>
       <w:sz w:val="40"/>
       <w:szCs w:val="40"/>
     </w:rPr>
@@ -6089,10 +7498,10 @@
     <w:basedOn w:val="DefaultParagraphFont"/>
     <w:link w:val="Heading1"/>
     <w:uiPriority w:val="9"/>
-    <w:rsid w:val="00301741"/>
+    <w:rsid w:val="001F3926"/>
     <w:rPr>
       <w:rFonts w:asciiTheme="majorHAnsi" w:eastAsiaTheme="majorEastAsia" w:hAnsiTheme="majorHAnsi" w:cstheme="majorBidi"/>
-      <w:color w:val="0F4761" w:themeColor="accent1" w:themeShade="BF"/>
+      <w:b/>
       <w:sz w:val="40"/>
       <w:szCs w:val="40"/>
     </w:rPr>
@@ -6242,18 +7651,18 @@
     <w:basedOn w:val="Normal"/>
     <w:next w:val="Normal"/>
     <w:link w:val="SubtitleChar"/>
+    <w:autoRedefine/>
     <w:uiPriority w:val="11"/>
     <w:qFormat/>
-    <w:rsid w:val="00301741"/>
+    <w:rsid w:val="001F3926"/>
     <w:pPr>
       <w:numPr>
         <w:ilvl w:val="1"/>
       </w:numPr>
+      <w:spacing w:after="0"/>
     </w:pPr>
     <w:rPr>
       <w:rFonts w:eastAsiaTheme="majorEastAsia" w:cstheme="majorBidi"/>
-      <w:color w:val="595959" w:themeColor="text1" w:themeTint="A6"/>
-      <w:spacing w:val="15"/>
       <w:sz w:val="28"/>
       <w:szCs w:val="28"/>
     </w:rPr>
@@ -6263,11 +7672,9 @@
     <w:basedOn w:val="DefaultParagraphFont"/>
     <w:link w:val="Subtitle"/>
     <w:uiPriority w:val="11"/>
-    <w:rsid w:val="00301741"/>
+    <w:rsid w:val="001F3926"/>
     <w:rPr>
       <w:rFonts w:eastAsiaTheme="majorEastAsia" w:cstheme="majorBidi"/>
-      <w:color w:val="595959" w:themeColor="text1" w:themeTint="A6"/>
-      <w:spacing w:val="15"/>
       <w:sz w:val="28"/>
       <w:szCs w:val="28"/>
     </w:rPr>

</xml_diff>